<commit_message>
decision tree notes added
</commit_message>
<xml_diff>
--- a/AiMl/Machine learning notes.docx
+++ b/AiMl/Machine learning notes.docx
@@ -15682,7 +15682,7 @@
     <w:p>
       <w:r>
         <w:pict w14:anchorId="62C8B5B7">
-          <v:rect id="_x0000_i1359" style="width:0;height:1.5pt" o:hralign="center" o:hrstd="t" o:hr="t" fillcolor="#a0a0a0" stroked="f"/>
+          <v:rect id="_x0000_i1066" style="width:0;height:1.5pt" o:hralign="center" o:hrstd="t" o:hr="t" fillcolor="#a0a0a0" stroked="f"/>
         </w:pict>
       </w:r>
     </w:p>
@@ -15942,6 +15942,7 @@
           </w:tcPr>
           <w:p>
             <w:r>
+              <w:lastRenderedPageBreak/>
               <w:t>4</w:t>
             </w:r>
           </w:p>
@@ -15986,7 +15987,7 @@
     <w:p>
       <w:r>
         <w:pict w14:anchorId="48F02B82">
-          <v:rect id="_x0000_i1360" style="width:0;height:1.5pt" o:hralign="center" o:hrstd="t" o:hr="t" fillcolor="#a0a0a0" stroked="f"/>
+          <v:rect id="_x0000_i1067" style="width:0;height:1.5pt" o:hralign="center" o:hrstd="t" o:hr="t" fillcolor="#a0a0a0" stroked="f"/>
         </w:pict>
       </w:r>
     </w:p>
@@ -16062,7 +16063,7 @@
     <w:p>
       <w:r>
         <w:pict w14:anchorId="40C207FF">
-          <v:rect id="_x0000_i1361" style="width:0;height:1.5pt" o:hralign="center" o:hrstd="t" o:hr="t" fillcolor="#a0a0a0" stroked="f"/>
+          <v:rect id="_x0000_i1068" style="width:0;height:1.5pt" o:hralign="center" o:hrstd="t" o:hr="t" fillcolor="#a0a0a0" stroked="f"/>
         </w:pict>
       </w:r>
     </w:p>
@@ -16126,7 +16127,7 @@
     <w:p>
       <w:r>
         <w:pict w14:anchorId="6EB99F72">
-          <v:rect id="_x0000_i1362" style="width:0;height:1.5pt" o:hralign="center" o:hrstd="t" o:hr="t" fillcolor="#a0a0a0" stroked="f"/>
+          <v:rect id="_x0000_i1069" style="width:0;height:1.5pt" o:hralign="center" o:hrstd="t" o:hr="t" fillcolor="#a0a0a0" stroked="f"/>
         </w:pict>
       </w:r>
     </w:p>
@@ -16153,7 +16154,7 @@
     <w:p>
       <w:r>
         <w:pict w14:anchorId="6226C223">
-          <v:rect id="_x0000_i1363" style="width:0;height:1.5pt" o:hralign="center" o:hrstd="t" o:hr="t" fillcolor="#a0a0a0" stroked="f"/>
+          <v:rect id="_x0000_i1070" style="width:0;height:1.5pt" o:hralign="center" o:hrstd="t" o:hr="t" fillcolor="#a0a0a0" stroked="f"/>
         </w:pict>
       </w:r>
     </w:p>
@@ -16180,7 +16181,7 @@
     <w:p>
       <w:r>
         <w:pict w14:anchorId="03F29DF2">
-          <v:rect id="_x0000_i1364" style="width:0;height:1.5pt" o:hralign="center" o:hrstd="t" o:hr="t" fillcolor="#a0a0a0" stroked="f"/>
+          <v:rect id="_x0000_i1071" style="width:0;height:1.5pt" o:hralign="center" o:hrstd="t" o:hr="t" fillcolor="#a0a0a0" stroked="f"/>
         </w:pict>
       </w:r>
     </w:p>
@@ -16207,7 +16208,7 @@
     <w:p>
       <w:r>
         <w:pict w14:anchorId="0DA20F9B">
-          <v:rect id="_x0000_i1365" style="width:0;height:1.5pt" o:hralign="center" o:hrstd="t" o:hr="t" fillcolor="#a0a0a0" stroked="f"/>
+          <v:rect id="_x0000_i1072" style="width:0;height:1.5pt" o:hralign="center" o:hrstd="t" o:hr="t" fillcolor="#a0a0a0" stroked="f"/>
         </w:pict>
       </w:r>
     </w:p>
@@ -16249,6 +16250,7 @@
         </w:numPr>
       </w:pPr>
       <w:r>
+        <w:lastRenderedPageBreak/>
         <w:t>High Bias</w:t>
       </w:r>
     </w:p>
@@ -16271,7 +16273,7 @@
     <w:p>
       <w:r>
         <w:pict w14:anchorId="1D3D53C0">
-          <v:rect id="_x0000_i1366" style="width:0;height:1.5pt" o:hralign="center" o:hrstd="t" o:hr="t" fillcolor="#a0a0a0" stroked="f"/>
+          <v:rect id="_x0000_i1073" style="width:0;height:1.5pt" o:hralign="center" o:hrstd="t" o:hr="t" fillcolor="#a0a0a0" stroked="f"/>
         </w:pict>
       </w:r>
     </w:p>
@@ -16320,7 +16322,7 @@
     <w:p>
       <w:r>
         <w:pict w14:anchorId="54C2A731">
-          <v:rect id="_x0000_i1367" style="width:0;height:1.5pt" o:hralign="center" o:hrstd="t" o:hr="t" fillcolor="#a0a0a0" stroked="f"/>
+          <v:rect id="_x0000_i1074" style="width:0;height:1.5pt" o:hralign="center" o:hrstd="t" o:hr="t" fillcolor="#a0a0a0" stroked="f"/>
         </w:pict>
       </w:r>
     </w:p>
@@ -16389,7 +16391,7 @@
     <w:p>
       <w:r>
         <w:pict w14:anchorId="4A94F6B7">
-          <v:rect id="_x0000_i1368" style="width:0;height:1.5pt" o:hralign="center" o:hrstd="t" o:hr="t" fillcolor="#a0a0a0" stroked="f"/>
+          <v:rect id="_x0000_i1075" style="width:0;height:1.5pt" o:hralign="center" o:hrstd="t" o:hr="t" fillcolor="#a0a0a0" stroked="f"/>
         </w:pict>
       </w:r>
     </w:p>
@@ -16441,7 +16443,7 @@
     <w:p>
       <w:r>
         <w:pict w14:anchorId="4FC9A43E">
-          <v:rect id="_x0000_i1369" style="width:0;height:1.5pt" o:hralign="center" o:hrstd="t" o:hr="t" fillcolor="#a0a0a0" stroked="f"/>
+          <v:rect id="_x0000_i1076" style="width:0;height:1.5pt" o:hralign="center" o:hrstd="t" o:hr="t" fillcolor="#a0a0a0" stroked="f"/>
         </w:pict>
       </w:r>
     </w:p>
@@ -16478,7 +16480,7 @@
     <w:p>
       <w:r>
         <w:pict w14:anchorId="05AECF98">
-          <v:rect id="_x0000_i1370" style="width:0;height:1.5pt" o:hralign="center" o:hrstd="t" o:hr="t" fillcolor="#a0a0a0" stroked="f"/>
+          <v:rect id="_x0000_i1077" style="width:0;height:1.5pt" o:hralign="center" o:hrstd="t" o:hr="t" fillcolor="#a0a0a0" stroked="f"/>
         </w:pict>
       </w:r>
     </w:p>
@@ -16519,8 +16521,9 @@
     </w:p>
     <w:p>
       <w:r>
+        <w:lastRenderedPageBreak/>
         <w:pict w14:anchorId="1E5EB15E">
-          <v:rect id="_x0000_i1371" style="width:0;height:1.5pt" o:hralign="center" o:hrstd="t" o:hr="t" fillcolor="#a0a0a0" stroked="f"/>
+          <v:rect id="_x0000_i1078" style="width:0;height:1.5pt" o:hralign="center" o:hrstd="t" o:hr="t" fillcolor="#a0a0a0" stroked="f"/>
         </w:pict>
       </w:r>
     </w:p>
@@ -16547,7 +16550,7 @@
     <w:p>
       <w:r>
         <w:pict w14:anchorId="31C73100">
-          <v:rect id="_x0000_i1372" style="width:0;height:1.5pt" o:hralign="center" o:hrstd="t" o:hr="t" fillcolor="#a0a0a0" stroked="f"/>
+          <v:rect id="_x0000_i1079" style="width:0;height:1.5pt" o:hralign="center" o:hrstd="t" o:hr="t" fillcolor="#a0a0a0" stroked="f"/>
         </w:pict>
       </w:r>
     </w:p>
@@ -16574,7 +16577,7 @@
     <w:p>
       <w:r>
         <w:pict w14:anchorId="41AF9C46">
-          <v:rect id="_x0000_i1373" style="width:0;height:1.5pt" o:hralign="center" o:hrstd="t" o:hr="t" fillcolor="#a0a0a0" stroked="f"/>
+          <v:rect id="_x0000_i1080" style="width:0;height:1.5pt" o:hralign="center" o:hrstd="t" o:hr="t" fillcolor="#a0a0a0" stroked="f"/>
         </w:pict>
       </w:r>
     </w:p>
@@ -16623,7 +16626,7 @@
     <w:p>
       <w:r>
         <w:pict w14:anchorId="090B0A04">
-          <v:rect id="_x0000_i1374" style="width:0;height:1.5pt" o:hralign="center" o:hrstd="t" o:hr="t" fillcolor="#a0a0a0" stroked="f"/>
+          <v:rect id="_x0000_i1081" style="width:0;height:1.5pt" o:hralign="center" o:hrstd="t" o:hr="t" fillcolor="#a0a0a0" stroked="f"/>
         </w:pict>
       </w:r>
     </w:p>
@@ -16650,7 +16653,7 @@
     <w:p>
       <w:r>
         <w:pict w14:anchorId="078BF41A">
-          <v:rect id="_x0000_i1375" style="width:0;height:1.5pt" o:hralign="center" o:hrstd="t" o:hr="t" fillcolor="#a0a0a0" stroked="f"/>
+          <v:rect id="_x0000_i1082" style="width:0;height:1.5pt" o:hralign="center" o:hrstd="t" o:hr="t" fillcolor="#a0a0a0" stroked="f"/>
         </w:pict>
       </w:r>
     </w:p>
@@ -16699,7 +16702,7 @@
     <w:p>
       <w:r>
         <w:pict w14:anchorId="1F204936">
-          <v:rect id="_x0000_i1376" style="width:0;height:1.5pt" o:hralign="center" o:hrstd="t" o:hr="t" fillcolor="#a0a0a0" stroked="f"/>
+          <v:rect id="_x0000_i1083" style="width:0;height:1.5pt" o:hralign="center" o:hrstd="t" o:hr="t" fillcolor="#a0a0a0" stroked="f"/>
         </w:pict>
       </w:r>
     </w:p>
@@ -16730,7 +16733,7 @@
     <w:p>
       <w:r>
         <w:pict w14:anchorId="34A56633">
-          <v:rect id="_x0000_i1377" style="width:0;height:1.5pt" o:hralign="center" o:hrstd="t" o:hr="t" fillcolor="#a0a0a0" stroked="f"/>
+          <v:rect id="_x0000_i1084" style="width:0;height:1.5pt" o:hralign="center" o:hrstd="t" o:hr="t" fillcolor="#a0a0a0" stroked="f"/>
         </w:pict>
       </w:r>
     </w:p>
@@ -16794,6 +16797,7 @@
     </w:p>
     <w:p>
       <w:r>
+        <w:lastRenderedPageBreak/>
         <w:t>Tree 1</w:t>
       </w:r>
     </w:p>
@@ -16830,7 +16834,7 @@
     <w:p>
       <w:r>
         <w:pict w14:anchorId="484E743D">
-          <v:rect id="_x0000_i1378" style="width:0;height:1.5pt" o:hralign="center" o:hrstd="t" o:hr="t" fillcolor="#a0a0a0" stroked="f"/>
+          <v:rect id="_x0000_i1085" style="width:0;height:1.5pt" o:hralign="center" o:hrstd="t" o:hr="t" fillcolor="#a0a0a0" stroked="f"/>
         </w:pict>
       </w:r>
     </w:p>
@@ -16895,7 +16899,7 @@
     <w:p>
       <w:r>
         <w:pict w14:anchorId="04CE2D78">
-          <v:rect id="_x0000_i1379" style="width:0;height:1.5pt" o:hralign="center" o:hrstd="t" o:hr="t" fillcolor="#a0a0a0" stroked="f"/>
+          <v:rect id="_x0000_i1086" style="width:0;height:1.5pt" o:hralign="center" o:hrstd="t" o:hr="t" fillcolor="#a0a0a0" stroked="f"/>
         </w:pict>
       </w:r>
     </w:p>
@@ -16997,7 +17001,7 @@
     <w:p>
       <w:r>
         <w:pict w14:anchorId="74B2F7E2">
-          <v:rect id="_x0000_i1380" style="width:0;height:1.5pt" o:hralign="center" o:hrstd="t" o:hr="t" fillcolor="#a0a0a0" stroked="f"/>
+          <v:rect id="_x0000_i1087" style="width:0;height:1.5pt" o:hralign="center" o:hrstd="t" o:hr="t" fillcolor="#a0a0a0" stroked="f"/>
         </w:pict>
       </w:r>
     </w:p>
@@ -17023,6 +17027,7 @@
     </w:p>
     <w:p>
       <w:r>
+        <w:lastRenderedPageBreak/>
         <w:t>Dataset 1 → Tree 1</w:t>
       </w:r>
     </w:p>
@@ -17044,7 +17049,7 @@
     <w:p>
       <w:r>
         <w:pict w14:anchorId="10DC8826">
-          <v:rect id="_x0000_i1381" style="width:0;height:1.5pt" o:hralign="center" o:hrstd="t" o:hr="t" fillcolor="#a0a0a0" stroked="f"/>
+          <v:rect id="_x0000_i1088" style="width:0;height:1.5pt" o:hralign="center" o:hrstd="t" o:hr="t" fillcolor="#a0a0a0" stroked="f"/>
         </w:pict>
       </w:r>
     </w:p>
@@ -17076,7 +17081,7 @@
     <w:p>
       <w:r>
         <w:pict w14:anchorId="775FD4C5">
-          <v:rect id="_x0000_i1382" style="width:0;height:1.5pt" o:hralign="center" o:hrstd="t" o:hr="t" fillcolor="#a0a0a0" stroked="f"/>
+          <v:rect id="_x0000_i1089" style="width:0;height:1.5pt" o:hralign="center" o:hrstd="t" o:hr="t" fillcolor="#a0a0a0" stroked="f"/>
         </w:pict>
       </w:r>
     </w:p>
@@ -17103,7 +17108,7 @@
     <w:p>
       <w:r>
         <w:pict w14:anchorId="327287E6">
-          <v:rect id="_x0000_i1383" style="width:0;height:1.5pt" o:hralign="center" o:hrstd="t" o:hr="t" fillcolor="#a0a0a0" stroked="f"/>
+          <v:rect id="_x0000_i1090" style="width:0;height:1.5pt" o:hralign="center" o:hrstd="t" o:hr="t" fillcolor="#a0a0a0" stroked="f"/>
         </w:pict>
       </w:r>
     </w:p>
@@ -17182,7 +17187,7 @@
     <w:p>
       <w:r>
         <w:pict w14:anchorId="6ED43F9E">
-          <v:rect id="_x0000_i1384" style="width:0;height:1.5pt" o:hralign="center" o:hrstd="t" o:hr="t" fillcolor="#a0a0a0" stroked="f"/>
+          <v:rect id="_x0000_i1091" style="width:0;height:1.5pt" o:hralign="center" o:hrstd="t" o:hr="t" fillcolor="#a0a0a0" stroked="f"/>
         </w:pict>
       </w:r>
     </w:p>
@@ -17240,6 +17245,7 @@
     </w:p>
     <w:p>
       <w:r>
+        <w:lastRenderedPageBreak/>
         <w:t>Prediction:</w:t>
       </w:r>
     </w:p>
@@ -17301,7 +17307,7 @@
     <w:p>
       <w:r>
         <w:pict w14:anchorId="5F999206">
-          <v:rect id="_x0000_i1385" style="width:0;height:1.5pt" o:hralign="center" o:hrstd="t" o:hr="t" fillcolor="#a0a0a0" stroked="f"/>
+          <v:rect id="_x0000_i1092" style="width:0;height:1.5pt" o:hralign="center" o:hrstd="t" o:hr="t" fillcolor="#a0a0a0" stroked="f"/>
         </w:pict>
       </w:r>
     </w:p>
@@ -17373,7 +17379,7 @@
     <w:p>
       <w:r>
         <w:pict w14:anchorId="2183D350">
-          <v:rect id="_x0000_i1386" style="width:0;height:1.5pt" o:hralign="center" o:hrstd="t" o:hr="t" fillcolor="#a0a0a0" stroked="f"/>
+          <v:rect id="_x0000_i1093" style="width:0;height:1.5pt" o:hralign="center" o:hrstd="t" o:hr="t" fillcolor="#a0a0a0" stroked="f"/>
         </w:pict>
       </w:r>
     </w:p>
@@ -17455,7 +17461,7 @@
     <w:p>
       <w:r>
         <w:pict w14:anchorId="594E6373">
-          <v:rect id="_x0000_i1387" style="width:0;height:1.5pt" o:hralign="center" o:hrstd="t" o:hr="t" fillcolor="#a0a0a0" stroked="f"/>
+          <v:rect id="_x0000_i1094" style="width:0;height:1.5pt" o:hralign="center" o:hrstd="t" o:hr="t" fillcolor="#a0a0a0" stroked="f"/>
         </w:pict>
       </w:r>
     </w:p>
@@ -17486,6 +17492,7 @@
     </w:p>
     <w:p>
       <w:r>
+        <w:lastRenderedPageBreak/>
         <w:t>random errors tend to cancel out.</w:t>
       </w:r>
     </w:p>
@@ -17530,7 +17537,7 @@
     <w:p>
       <w:r>
         <w:pict w14:anchorId="2F4A263E">
-          <v:rect id="_x0000_i1388" style="width:0;height:1.5pt" o:hralign="center" o:hrstd="t" o:hr="t" fillcolor="#a0a0a0" stroked="f"/>
+          <v:rect id="_x0000_i1095" style="width:0;height:1.5pt" o:hralign="center" o:hrstd="t" o:hr="t" fillcolor="#a0a0a0" stroked="f"/>
         </w:pict>
       </w:r>
     </w:p>
@@ -17609,7 +17616,7 @@
     <w:p>
       <w:r>
         <w:pict w14:anchorId="4AA9EED7">
-          <v:rect id="_x0000_i1389" style="width:0;height:1.5pt" o:hralign="center" o:hrstd="t" o:hr="t" fillcolor="#a0a0a0" stroked="f"/>
+          <v:rect id="_x0000_i1096" style="width:0;height:1.5pt" o:hralign="center" o:hrstd="t" o:hr="t" fillcolor="#a0a0a0" stroked="f"/>
         </w:pict>
       </w:r>
     </w:p>
@@ -17641,7 +17648,7 @@
     <w:p>
       <w:r>
         <w:pict w14:anchorId="743C9188">
-          <v:rect id="_x0000_i1390" style="width:0;height:1.5pt" o:hralign="center" o:hrstd="t" o:hr="t" fillcolor="#a0a0a0" stroked="f"/>
+          <v:rect id="_x0000_i1097" style="width:0;height:1.5pt" o:hralign="center" o:hrstd="t" o:hr="t" fillcolor="#a0a0a0" stroked="f"/>
         </w:pict>
       </w:r>
     </w:p>
@@ -17678,7 +17685,7 @@
     <w:p>
       <w:r>
         <w:pict w14:anchorId="52A81008">
-          <v:rect id="_x0000_i1391" style="width:0;height:1.5pt" o:hralign="center" o:hrstd="t" o:hr="t" fillcolor="#a0a0a0" stroked="f"/>
+          <v:rect id="_x0000_i1098" style="width:0;height:1.5pt" o:hralign="center" o:hrstd="t" o:hr="t" fillcolor="#a0a0a0" stroked="f"/>
         </w:pict>
       </w:r>
     </w:p>
@@ -17710,7 +17717,7 @@
     <w:p>
       <w:r>
         <w:pict w14:anchorId="147BE60A">
-          <v:rect id="_x0000_i1392" style="width:0;height:1.5pt" o:hralign="center" o:hrstd="t" o:hr="t" fillcolor="#a0a0a0" stroked="f"/>
+          <v:rect id="_x0000_i1099" style="width:0;height:1.5pt" o:hralign="center" o:hrstd="t" o:hr="t" fillcolor="#a0a0a0" stroked="f"/>
         </w:pict>
       </w:r>
     </w:p>
@@ -17808,8 +17815,9 @@
     </w:p>
     <w:p>
       <w:r>
+        <w:lastRenderedPageBreak/>
         <w:pict w14:anchorId="7034CD05">
-          <v:rect id="_x0000_i1393" style="width:0;height:1.5pt" o:hralign="center" o:hrstd="t" o:hr="t" fillcolor="#a0a0a0" stroked="f"/>
+          <v:rect id="_x0000_i1100" style="width:0;height:1.5pt" o:hralign="center" o:hrstd="t" o:hr="t" fillcolor="#a0a0a0" stroked="f"/>
         </w:pict>
       </w:r>
     </w:p>
@@ -17875,7 +17883,7 @@
     <w:p>
       <w:r>
         <w:pict w14:anchorId="34AA2C48">
-          <v:rect id="_x0000_i1394" style="width:0;height:1.5pt" o:hralign="center" o:hrstd="t" o:hr="t" fillcolor="#a0a0a0" stroked="f"/>
+          <v:rect id="_x0000_i1101" style="width:0;height:1.5pt" o:hralign="center" o:hrstd="t" o:hr="t" fillcolor="#a0a0a0" stroked="f"/>
         </w:pict>
       </w:r>
     </w:p>
@@ -18362,7 +18370,7 @@
     <w:p>
       <w:r>
         <w:pict w14:anchorId="7F719C8C">
-          <v:rect id="_x0000_i1395" style="width:0;height:1.5pt" o:hralign="center" o:hrstd="t" o:hr="t" fillcolor="#a0a0a0" stroked="f"/>
+          <v:rect id="_x0000_i1102" style="width:0;height:1.5pt" o:hralign="center" o:hrstd="t" o:hr="t" fillcolor="#a0a0a0" stroked="f"/>
         </w:pict>
       </w:r>
     </w:p>
@@ -18404,7 +18412,7 @@
     <w:p>
       <w:r>
         <w:pict w14:anchorId="448F9142">
-          <v:rect id="_x0000_i1396" style="width:0;height:1.5pt" o:hralign="center" o:hrstd="t" o:hr="t" fillcolor="#a0a0a0" stroked="f"/>
+          <v:rect id="_x0000_i1103" style="width:0;height:1.5pt" o:hralign="center" o:hrstd="t" o:hr="t" fillcolor="#a0a0a0" stroked="f"/>
         </w:pict>
       </w:r>
     </w:p>
@@ -18431,7 +18439,7 @@
     <w:p>
       <w:r>
         <w:pict w14:anchorId="52C4681E">
-          <v:rect id="_x0000_i1397" style="width:0;height:1.5pt" o:hralign="center" o:hrstd="t" o:hr="t" fillcolor="#a0a0a0" stroked="f"/>
+          <v:rect id="_x0000_i1104" style="width:0;height:1.5pt" o:hralign="center" o:hrstd="t" o:hr="t" fillcolor="#a0a0a0" stroked="f"/>
         </w:pict>
       </w:r>
     </w:p>
@@ -18458,7 +18466,7 @@
     <w:p>
       <w:r>
         <w:pict w14:anchorId="53DB2A41">
-          <v:rect id="_x0000_i1398" style="width:0;height:1.5pt" o:hralign="center" o:hrstd="t" o:hr="t" fillcolor="#a0a0a0" stroked="f"/>
+          <v:rect id="_x0000_i1105" style="width:0;height:1.5pt" o:hralign="center" o:hrstd="t" o:hr="t" fillcolor="#a0a0a0" stroked="f"/>
         </w:pict>
       </w:r>
     </w:p>
@@ -18501,8 +18509,9 @@
     </w:p>
     <w:p>
       <w:r>
+        <w:lastRenderedPageBreak/>
         <w:pict w14:anchorId="19F0D3E9">
-          <v:rect id="_x0000_i1399" style="width:0;height:1.5pt" o:hralign="center" o:hrstd="t" o:hr="t" fillcolor="#a0a0a0" stroked="f"/>
+          <v:rect id="_x0000_i1106" style="width:0;height:1.5pt" o:hralign="center" o:hrstd="t" o:hr="t" fillcolor="#a0a0a0" stroked="f"/>
         </w:pict>
       </w:r>
     </w:p>
@@ -18538,7 +18547,7 @@
     <w:p>
       <w:r>
         <w:pict w14:anchorId="46FE5262">
-          <v:rect id="_x0000_i1400" style="width:0;height:1.5pt" o:hralign="center" o:hrstd="t" o:hr="t" fillcolor="#a0a0a0" stroked="f"/>
+          <v:rect id="_x0000_i1107" style="width:0;height:1.5pt" o:hralign="center" o:hrstd="t" o:hr="t" fillcolor="#a0a0a0" stroked="f"/>
         </w:pict>
       </w:r>
     </w:p>
@@ -18755,6 +18764,1891 @@
     <w:p>
       <w:r>
         <w:t>A committee usually makes better decisions than a single person, which is exactly why Random Forest often performs better than a single Decision Tree.</w:t>
+      </w:r>
+    </w:p>
+    <w:p>
+      <w:pPr>
+        <w:spacing w:before="100" w:beforeAutospacing="1" w:after="100" w:afterAutospacing="1" w:line="300" w:lineRule="atLeast"/>
+        <w:outlineLvl w:val="0"/>
+        <w:rPr>
+          <w:rFonts w:ascii="Segoe UI" w:eastAsia="Times New Roman" w:hAnsi="Segoe UI" w:cs="Segoe UI"/>
+          <w:b/>
+          <w:bCs/>
+          <w:kern w:val="36"/>
+          <w:sz w:val="48"/>
+          <w:szCs w:val="48"/>
+          <w:lang w:eastAsia="en-IN" w:bidi="ar-SA"/>
+          <w14:ligatures w14:val="none"/>
+        </w:rPr>
+      </w:pPr>
+      <w:r>
+        <w:rPr>
+          <w:rFonts w:ascii="Segoe UI" w:eastAsia="Times New Roman" w:hAnsi="Segoe UI" w:cs="Segoe UI"/>
+          <w:b/>
+          <w:bCs/>
+          <w:kern w:val="36"/>
+          <w:sz w:val="48"/>
+          <w:szCs w:val="48"/>
+          <w:lang w:eastAsia="en-IN" w:bidi="ar-SA"/>
+          <w14:ligatures w14:val="none"/>
+        </w:rPr>
+        <w:t>Random Forest and Bagging</w:t>
+      </w:r>
+    </w:p>
+    <w:p>
+      <w:pPr>
+        <w:spacing w:before="100" w:beforeAutospacing="1" w:after="100" w:afterAutospacing="1" w:line="300" w:lineRule="atLeast"/>
+        <w:rPr>
+          <w:rFonts w:ascii="Segoe UI" w:eastAsia="Times New Roman" w:hAnsi="Segoe UI" w:cs="Segoe UI"/>
+          <w:kern w:val="0"/>
+          <w:sz w:val="21"/>
+          <w:szCs w:val="21"/>
+          <w:lang w:eastAsia="en-IN" w:bidi="ar-SA"/>
+          <w14:ligatures w14:val="none"/>
+        </w:rPr>
+      </w:pPr>
+      <w:r>
+        <w:rPr>
+          <w:rFonts w:ascii="Segoe UI" w:eastAsia="Times New Roman" w:hAnsi="Segoe UI" w:cs="Segoe UI"/>
+          <w:kern w:val="0"/>
+          <w:sz w:val="21"/>
+          <w:szCs w:val="21"/>
+          <w:lang w:eastAsia="en-IN" w:bidi="ar-SA"/>
+          <w14:ligatures w14:val="none"/>
+        </w:rPr>
+        <w:t>Random Forest is essentially:</w:t>
+      </w:r>
+    </w:p>
+    <w:p>
+      <w:pPr>
+        <w:spacing w:after="0" w:line="300" w:lineRule="atLeast"/>
+        <w:rPr>
+          <w:rFonts w:ascii="Segoe UI" w:eastAsia="Times New Roman" w:hAnsi="Segoe UI" w:cs="Segoe UI"/>
+          <w:kern w:val="0"/>
+          <w:sz w:val="21"/>
+          <w:szCs w:val="21"/>
+          <w:lang w:eastAsia="en-IN" w:bidi="ar-SA"/>
+          <w14:ligatures w14:val="none"/>
+        </w:rPr>
+      </w:pPr>
+      <m:oMathPara>
+        <m:oMath>
+          <m:borderBox>
+            <m:borderBoxPr>
+              <m:ctrlPr>
+                <w:rPr>
+                  <w:rFonts w:ascii="Cambria Math" w:eastAsia="Times New Roman" w:hAnsi="Cambria Math" w:cs="Times New Roman"/>
+                  <w:kern w:val="0"/>
+                  <w:sz w:val="24"/>
+                  <w:szCs w:val="24"/>
+                  <w:lang w:eastAsia="en-IN" w:bidi="ar-SA"/>
+                  <w14:ligatures w14:val="none"/>
+                </w:rPr>
+              </m:ctrlPr>
+            </m:borderBoxPr>
+            <m:e>
+              <m:r>
+                <m:rPr>
+                  <m:nor/>
+                </m:rPr>
+                <w:rPr>
+                  <w:rFonts w:ascii="Times New Roman" w:eastAsia="Times New Roman" w:hAnsi="Times New Roman" w:cs="Times New Roman"/>
+                  <w:kern w:val="0"/>
+                  <w:sz w:val="24"/>
+                  <w:szCs w:val="24"/>
+                  <w:lang w:eastAsia="en-IN" w:bidi="ar-SA"/>
+                  <w14:ligatures w14:val="none"/>
+                </w:rPr>
+                <m:t>Bagging + Random Feature Selection</m:t>
+              </m:r>
+            </m:e>
+          </m:borderBox>
+          <m:r>
+            <w:rPr>
+              <w:rFonts w:ascii="Cambria Math" w:eastAsia="Times New Roman" w:hAnsi="Cambria Math" w:cs="Times New Roman"/>
+              <w:kern w:val="0"/>
+              <w:sz w:val="24"/>
+              <w:szCs w:val="24"/>
+              <w:lang w:eastAsia="en-IN" w:bidi="ar-SA"/>
+              <w14:ligatures w14:val="none"/>
+            </w:rPr>
+            <w:br/>
+          </m:r>
+        </m:oMath>
+      </m:oMathPara>
+    </w:p>
+    <w:p>
+      <w:pPr>
+        <w:spacing w:before="100" w:beforeAutospacing="1" w:after="100" w:afterAutospacing="1" w:line="300" w:lineRule="atLeast"/>
+        <w:outlineLvl w:val="2"/>
+        <w:rPr>
+          <w:rFonts w:ascii="Segoe UI" w:eastAsia="Times New Roman" w:hAnsi="Segoe UI" w:cs="Segoe UI"/>
+          <w:b/>
+          <w:bCs/>
+          <w:kern w:val="0"/>
+          <w:sz w:val="27"/>
+          <w:szCs w:val="27"/>
+          <w:lang w:eastAsia="en-IN" w:bidi="ar-SA"/>
+          <w14:ligatures w14:val="none"/>
+        </w:rPr>
+      </w:pPr>
+      <w:r>
+        <w:rPr>
+          <w:rFonts w:ascii="Segoe UI" w:eastAsia="Times New Roman" w:hAnsi="Segoe UI" w:cs="Segoe UI"/>
+          <w:b/>
+          <w:bCs/>
+          <w:kern w:val="0"/>
+          <w:sz w:val="27"/>
+          <w:szCs w:val="27"/>
+          <w:lang w:eastAsia="en-IN" w:bidi="ar-SA"/>
+          <w14:ligatures w14:val="none"/>
+        </w:rPr>
+        <w:lastRenderedPageBreak/>
+        <w:t>Bagging</w:t>
+      </w:r>
+    </w:p>
+    <w:p>
+      <w:pPr>
+        <w:numPr>
+          <w:ilvl w:val="0"/>
+          <w:numId w:val="138"/>
+        </w:numPr>
+        <w:spacing w:before="100" w:beforeAutospacing="1" w:after="100" w:afterAutospacing="1" w:line="300" w:lineRule="atLeast"/>
+        <w:rPr>
+          <w:rFonts w:ascii="Segoe UI" w:eastAsia="Times New Roman" w:hAnsi="Segoe UI" w:cs="Segoe UI"/>
+          <w:kern w:val="0"/>
+          <w:sz w:val="21"/>
+          <w:szCs w:val="21"/>
+          <w:lang w:eastAsia="en-IN" w:bidi="ar-SA"/>
+          <w14:ligatures w14:val="none"/>
+        </w:rPr>
+      </w:pPr>
+      <w:r>
+        <w:rPr>
+          <w:rFonts w:ascii="Segoe UI" w:eastAsia="Times New Roman" w:hAnsi="Segoe UI" w:cs="Segoe UI"/>
+          <w:kern w:val="0"/>
+          <w:sz w:val="21"/>
+          <w:szCs w:val="21"/>
+          <w:lang w:eastAsia="en-IN" w:bidi="ar-SA"/>
+          <w14:ligatures w14:val="none"/>
+        </w:rPr>
+        <w:t>Bootstrap samples</w:t>
+      </w:r>
+    </w:p>
+    <w:p>
+      <w:pPr>
+        <w:numPr>
+          <w:ilvl w:val="0"/>
+          <w:numId w:val="138"/>
+        </w:numPr>
+        <w:spacing w:before="100" w:beforeAutospacing="1" w:after="100" w:afterAutospacing="1" w:line="300" w:lineRule="atLeast"/>
+        <w:rPr>
+          <w:rFonts w:ascii="Segoe UI" w:eastAsia="Times New Roman" w:hAnsi="Segoe UI" w:cs="Segoe UI"/>
+          <w:kern w:val="0"/>
+          <w:sz w:val="21"/>
+          <w:szCs w:val="21"/>
+          <w:lang w:eastAsia="en-IN" w:bidi="ar-SA"/>
+          <w14:ligatures w14:val="none"/>
+        </w:rPr>
+      </w:pPr>
+      <w:r>
+        <w:rPr>
+          <w:rFonts w:ascii="Segoe UI" w:eastAsia="Times New Roman" w:hAnsi="Segoe UI" w:cs="Segoe UI"/>
+          <w:kern w:val="0"/>
+          <w:sz w:val="21"/>
+          <w:szCs w:val="21"/>
+          <w:lang w:eastAsia="en-IN" w:bidi="ar-SA"/>
+          <w14:ligatures w14:val="none"/>
+        </w:rPr>
+        <w:t>Multiple trees</w:t>
+      </w:r>
+    </w:p>
+    <w:p>
+      <w:pPr>
+        <w:numPr>
+          <w:ilvl w:val="0"/>
+          <w:numId w:val="138"/>
+        </w:numPr>
+        <w:spacing w:before="100" w:beforeAutospacing="1" w:after="100" w:afterAutospacing="1" w:line="300" w:lineRule="atLeast"/>
+        <w:rPr>
+          <w:rFonts w:ascii="Segoe UI" w:eastAsia="Times New Roman" w:hAnsi="Segoe UI" w:cs="Segoe UI"/>
+          <w:kern w:val="0"/>
+          <w:sz w:val="21"/>
+          <w:szCs w:val="21"/>
+          <w:lang w:eastAsia="en-IN" w:bidi="ar-SA"/>
+          <w14:ligatures w14:val="none"/>
+        </w:rPr>
+      </w:pPr>
+      <w:r>
+        <w:rPr>
+          <w:rFonts w:ascii="Segoe UI" w:eastAsia="Times New Roman" w:hAnsi="Segoe UI" w:cs="Segoe UI"/>
+          <w:kern w:val="0"/>
+          <w:sz w:val="21"/>
+          <w:szCs w:val="21"/>
+          <w:lang w:eastAsia="en-IN" w:bidi="ar-SA"/>
+          <w14:ligatures w14:val="none"/>
+        </w:rPr>
+        <w:t>Majority voting / averaging</w:t>
+      </w:r>
+    </w:p>
+    <w:p>
+      <w:pPr>
+        <w:spacing w:before="100" w:beforeAutospacing="1" w:after="100" w:afterAutospacing="1" w:line="300" w:lineRule="atLeast"/>
+        <w:outlineLvl w:val="2"/>
+        <w:rPr>
+          <w:rFonts w:ascii="Segoe UI" w:eastAsia="Times New Roman" w:hAnsi="Segoe UI" w:cs="Segoe UI"/>
+          <w:b/>
+          <w:bCs/>
+          <w:kern w:val="0"/>
+          <w:sz w:val="27"/>
+          <w:szCs w:val="27"/>
+          <w:lang w:eastAsia="en-IN" w:bidi="ar-SA"/>
+          <w14:ligatures w14:val="none"/>
+        </w:rPr>
+      </w:pPr>
+      <w:r>
+        <w:rPr>
+          <w:rFonts w:ascii="Segoe UI" w:eastAsia="Times New Roman" w:hAnsi="Segoe UI" w:cs="Segoe UI"/>
+          <w:b/>
+          <w:bCs/>
+          <w:kern w:val="0"/>
+          <w:sz w:val="27"/>
+          <w:szCs w:val="27"/>
+          <w:lang w:eastAsia="en-IN" w:bidi="ar-SA"/>
+          <w14:ligatures w14:val="none"/>
+        </w:rPr>
+        <w:t>Random Forest</w:t>
+      </w:r>
+    </w:p>
+    <w:p>
+      <w:pPr>
+        <w:numPr>
+          <w:ilvl w:val="0"/>
+          <w:numId w:val="139"/>
+        </w:numPr>
+        <w:spacing w:before="100" w:beforeAutospacing="1" w:after="100" w:afterAutospacing="1" w:line="300" w:lineRule="atLeast"/>
+        <w:rPr>
+          <w:rFonts w:ascii="Segoe UI" w:eastAsia="Times New Roman" w:hAnsi="Segoe UI" w:cs="Segoe UI"/>
+          <w:kern w:val="0"/>
+          <w:sz w:val="21"/>
+          <w:szCs w:val="21"/>
+          <w:lang w:eastAsia="en-IN" w:bidi="ar-SA"/>
+          <w14:ligatures w14:val="none"/>
+        </w:rPr>
+      </w:pPr>
+      <w:r>
+        <w:rPr>
+          <w:rFonts w:ascii="Segoe UI" w:eastAsia="Times New Roman" w:hAnsi="Segoe UI" w:cs="Segoe UI"/>
+          <w:kern w:val="0"/>
+          <w:sz w:val="21"/>
+          <w:szCs w:val="21"/>
+          <w:lang w:eastAsia="en-IN" w:bidi="ar-SA"/>
+          <w14:ligatures w14:val="none"/>
+        </w:rPr>
+        <w:t>Bootstrap samples</w:t>
+      </w:r>
+    </w:p>
+    <w:p>
+      <w:pPr>
+        <w:numPr>
+          <w:ilvl w:val="0"/>
+          <w:numId w:val="139"/>
+        </w:numPr>
+        <w:spacing w:before="100" w:beforeAutospacing="1" w:after="100" w:afterAutospacing="1" w:line="300" w:lineRule="atLeast"/>
+        <w:rPr>
+          <w:rFonts w:ascii="Segoe UI" w:eastAsia="Times New Roman" w:hAnsi="Segoe UI" w:cs="Segoe UI"/>
+          <w:kern w:val="0"/>
+          <w:sz w:val="21"/>
+          <w:szCs w:val="21"/>
+          <w:lang w:eastAsia="en-IN" w:bidi="ar-SA"/>
+          <w14:ligatures w14:val="none"/>
+        </w:rPr>
+      </w:pPr>
+      <w:r>
+        <w:rPr>
+          <w:rFonts w:ascii="Segoe UI" w:eastAsia="Times New Roman" w:hAnsi="Segoe UI" w:cs="Segoe UI"/>
+          <w:kern w:val="0"/>
+          <w:sz w:val="21"/>
+          <w:szCs w:val="21"/>
+          <w:lang w:eastAsia="en-IN" w:bidi="ar-SA"/>
+          <w14:ligatures w14:val="none"/>
+        </w:rPr>
+        <w:t>Multiple trees</w:t>
+      </w:r>
+    </w:p>
+    <w:p>
+      <w:pPr>
+        <w:numPr>
+          <w:ilvl w:val="0"/>
+          <w:numId w:val="139"/>
+        </w:numPr>
+        <w:spacing w:before="100" w:beforeAutospacing="1" w:after="100" w:afterAutospacing="1" w:line="300" w:lineRule="atLeast"/>
+        <w:rPr>
+          <w:rFonts w:ascii="Segoe UI" w:eastAsia="Times New Roman" w:hAnsi="Segoe UI" w:cs="Segoe UI"/>
+          <w:kern w:val="0"/>
+          <w:sz w:val="21"/>
+          <w:szCs w:val="21"/>
+          <w:lang w:eastAsia="en-IN" w:bidi="ar-SA"/>
+          <w14:ligatures w14:val="none"/>
+        </w:rPr>
+      </w:pPr>
+      <w:r>
+        <w:rPr>
+          <w:rFonts w:ascii="Segoe UI" w:eastAsia="Times New Roman" w:hAnsi="Segoe UI" w:cs="Segoe UI"/>
+          <w:kern w:val="0"/>
+          <w:sz w:val="21"/>
+          <w:szCs w:val="21"/>
+          <w:lang w:eastAsia="en-IN" w:bidi="ar-SA"/>
+          <w14:ligatures w14:val="none"/>
+        </w:rPr>
+        <w:t>Random feature selection at each split</w:t>
+      </w:r>
+    </w:p>
+    <w:p>
+      <w:pPr>
+        <w:numPr>
+          <w:ilvl w:val="0"/>
+          <w:numId w:val="139"/>
+        </w:numPr>
+        <w:spacing w:before="100" w:beforeAutospacing="1" w:after="100" w:afterAutospacing="1" w:line="300" w:lineRule="atLeast"/>
+        <w:rPr>
+          <w:rFonts w:ascii="Segoe UI" w:eastAsia="Times New Roman" w:hAnsi="Segoe UI" w:cs="Segoe UI"/>
+          <w:kern w:val="0"/>
+          <w:sz w:val="21"/>
+          <w:szCs w:val="21"/>
+          <w:lang w:eastAsia="en-IN" w:bidi="ar-SA"/>
+          <w14:ligatures w14:val="none"/>
+        </w:rPr>
+      </w:pPr>
+      <w:r>
+        <w:rPr>
+          <w:rFonts w:ascii="Segoe UI" w:eastAsia="Times New Roman" w:hAnsi="Segoe UI" w:cs="Segoe UI"/>
+          <w:kern w:val="0"/>
+          <w:sz w:val="21"/>
+          <w:szCs w:val="21"/>
+          <w:lang w:eastAsia="en-IN" w:bidi="ar-SA"/>
+          <w14:ligatures w14:val="none"/>
+        </w:rPr>
+        <w:t>Majority voting / averaging</w:t>
+      </w:r>
+    </w:p>
+    <w:p>
+      <w:pPr>
+        <w:spacing w:before="100" w:beforeAutospacing="1" w:after="100" w:afterAutospacing="1" w:line="300" w:lineRule="atLeast"/>
+        <w:rPr>
+          <w:rFonts w:ascii="Segoe UI" w:eastAsia="Times New Roman" w:hAnsi="Segoe UI" w:cs="Segoe UI"/>
+          <w:kern w:val="0"/>
+          <w:sz w:val="21"/>
+          <w:szCs w:val="21"/>
+          <w:lang w:eastAsia="en-IN" w:bidi="ar-SA"/>
+          <w14:ligatures w14:val="none"/>
+        </w:rPr>
+      </w:pPr>
+      <w:r>
+        <w:rPr>
+          <w:rFonts w:ascii="Segoe UI" w:eastAsia="Times New Roman" w:hAnsi="Segoe UI" w:cs="Segoe UI"/>
+          <w:kern w:val="0"/>
+          <w:sz w:val="21"/>
+          <w:szCs w:val="21"/>
+          <w:lang w:eastAsia="en-IN" w:bidi="ar-SA"/>
+          <w14:ligatures w14:val="none"/>
+        </w:rPr>
+        <w:t>So:</w:t>
+      </w:r>
+    </w:p>
+    <w:p>
+      <w:pPr>
+        <w:tabs>
+          <w:tab w:val="left" w:pos="916"/>
+          <w:tab w:val="left" w:pos="1832"/>
+          <w:tab w:val="left" w:pos="2748"/>
+          <w:tab w:val="left" w:pos="3664"/>
+          <w:tab w:val="left" w:pos="4580"/>
+          <w:tab w:val="left" w:pos="5496"/>
+          <w:tab w:val="left" w:pos="6412"/>
+          <w:tab w:val="left" w:pos="7328"/>
+          <w:tab w:val="left" w:pos="8244"/>
+          <w:tab w:val="left" w:pos="9160"/>
+          <w:tab w:val="left" w:pos="10076"/>
+          <w:tab w:val="left" w:pos="10992"/>
+          <w:tab w:val="left" w:pos="11908"/>
+          <w:tab w:val="left" w:pos="12824"/>
+          <w:tab w:val="left" w:pos="13740"/>
+          <w:tab w:val="left" w:pos="14656"/>
+        </w:tabs>
+        <w:spacing w:after="0" w:line="300" w:lineRule="atLeast"/>
+        <w:rPr>
+          <w:rFonts w:ascii="Courier New" w:eastAsia="Times New Roman" w:hAnsi="Courier New" w:cs="Courier New"/>
+          <w:kern w:val="0"/>
+          <w:sz w:val="20"/>
+          <w:szCs w:val="20"/>
+          <w:lang w:eastAsia="en-IN" w:bidi="ar-SA"/>
+          <w14:ligatures w14:val="none"/>
+        </w:rPr>
+      </w:pPr>
+      <w:r>
+        <w:rPr>
+          <w:rFonts w:ascii="Courier New" w:eastAsia="Times New Roman" w:hAnsi="Courier New" w:cs="Courier New"/>
+          <w:kern w:val="0"/>
+          <w:sz w:val="20"/>
+          <w:szCs w:val="20"/>
+          <w:lang w:eastAsia="en-IN" w:bidi="ar-SA"/>
+          <w14:ligatures w14:val="none"/>
+        </w:rPr>
+        <w:t>Bagging Trees</w:t>
+      </w:r>
+    </w:p>
+    <w:p>
+      <w:pPr>
+        <w:tabs>
+          <w:tab w:val="left" w:pos="916"/>
+          <w:tab w:val="left" w:pos="1832"/>
+          <w:tab w:val="left" w:pos="2748"/>
+          <w:tab w:val="left" w:pos="3664"/>
+          <w:tab w:val="left" w:pos="4580"/>
+          <w:tab w:val="left" w:pos="5496"/>
+          <w:tab w:val="left" w:pos="6412"/>
+          <w:tab w:val="left" w:pos="7328"/>
+          <w:tab w:val="left" w:pos="8244"/>
+          <w:tab w:val="left" w:pos="9160"/>
+          <w:tab w:val="left" w:pos="10076"/>
+          <w:tab w:val="left" w:pos="10992"/>
+          <w:tab w:val="left" w:pos="11908"/>
+          <w:tab w:val="left" w:pos="12824"/>
+          <w:tab w:val="left" w:pos="13740"/>
+          <w:tab w:val="left" w:pos="14656"/>
+        </w:tabs>
+        <w:spacing w:after="0" w:line="300" w:lineRule="atLeast"/>
+        <w:rPr>
+          <w:rFonts w:ascii="Courier New" w:eastAsia="Times New Roman" w:hAnsi="Courier New" w:cs="Courier New"/>
+          <w:kern w:val="0"/>
+          <w:sz w:val="20"/>
+          <w:szCs w:val="20"/>
+          <w:lang w:eastAsia="en-IN" w:bidi="ar-SA"/>
+          <w14:ligatures w14:val="none"/>
+        </w:rPr>
+      </w:pPr>
+      <w:r>
+        <w:rPr>
+          <w:rFonts w:ascii="Courier New" w:eastAsia="Times New Roman" w:hAnsi="Courier New" w:cs="Courier New"/>
+          <w:kern w:val="0"/>
+          <w:sz w:val="20"/>
+          <w:szCs w:val="20"/>
+          <w:lang w:eastAsia="en-IN" w:bidi="ar-SA"/>
+          <w14:ligatures w14:val="none"/>
+        </w:rPr>
+        <w:t xml:space="preserve">      +</w:t>
+      </w:r>
+    </w:p>
+    <w:p>
+      <w:pPr>
+        <w:tabs>
+          <w:tab w:val="left" w:pos="916"/>
+          <w:tab w:val="left" w:pos="1832"/>
+          <w:tab w:val="left" w:pos="2748"/>
+          <w:tab w:val="left" w:pos="3664"/>
+          <w:tab w:val="left" w:pos="4580"/>
+          <w:tab w:val="left" w:pos="5496"/>
+          <w:tab w:val="left" w:pos="6412"/>
+          <w:tab w:val="left" w:pos="7328"/>
+          <w:tab w:val="left" w:pos="8244"/>
+          <w:tab w:val="left" w:pos="9160"/>
+          <w:tab w:val="left" w:pos="10076"/>
+          <w:tab w:val="left" w:pos="10992"/>
+          <w:tab w:val="left" w:pos="11908"/>
+          <w:tab w:val="left" w:pos="12824"/>
+          <w:tab w:val="left" w:pos="13740"/>
+          <w:tab w:val="left" w:pos="14656"/>
+        </w:tabs>
+        <w:spacing w:after="0" w:line="300" w:lineRule="atLeast"/>
+        <w:rPr>
+          <w:rFonts w:ascii="Courier New" w:eastAsia="Times New Roman" w:hAnsi="Courier New" w:cs="Courier New"/>
+          <w:kern w:val="0"/>
+          <w:sz w:val="20"/>
+          <w:szCs w:val="20"/>
+          <w:lang w:eastAsia="en-IN" w:bidi="ar-SA"/>
+          <w14:ligatures w14:val="none"/>
+        </w:rPr>
+      </w:pPr>
+      <w:r>
+        <w:rPr>
+          <w:rFonts w:ascii="Courier New" w:eastAsia="Times New Roman" w:hAnsi="Courier New" w:cs="Courier New"/>
+          <w:kern w:val="0"/>
+          <w:sz w:val="20"/>
+          <w:szCs w:val="20"/>
+          <w:lang w:eastAsia="en-IN" w:bidi="ar-SA"/>
+          <w14:ligatures w14:val="none"/>
+        </w:rPr>
+        <w:t>Random Feature Selection</w:t>
+      </w:r>
+    </w:p>
+    <w:p>
+      <w:pPr>
+        <w:tabs>
+          <w:tab w:val="left" w:pos="916"/>
+          <w:tab w:val="left" w:pos="1832"/>
+          <w:tab w:val="left" w:pos="2748"/>
+          <w:tab w:val="left" w:pos="3664"/>
+          <w:tab w:val="left" w:pos="4580"/>
+          <w:tab w:val="left" w:pos="5496"/>
+          <w:tab w:val="left" w:pos="6412"/>
+          <w:tab w:val="left" w:pos="7328"/>
+          <w:tab w:val="left" w:pos="8244"/>
+          <w:tab w:val="left" w:pos="9160"/>
+          <w:tab w:val="left" w:pos="10076"/>
+          <w:tab w:val="left" w:pos="10992"/>
+          <w:tab w:val="left" w:pos="11908"/>
+          <w:tab w:val="left" w:pos="12824"/>
+          <w:tab w:val="left" w:pos="13740"/>
+          <w:tab w:val="left" w:pos="14656"/>
+        </w:tabs>
+        <w:spacing w:after="0" w:line="300" w:lineRule="atLeast"/>
+        <w:rPr>
+          <w:rFonts w:ascii="Courier New" w:eastAsia="Times New Roman" w:hAnsi="Courier New" w:cs="Courier New"/>
+          <w:kern w:val="0"/>
+          <w:sz w:val="20"/>
+          <w:szCs w:val="20"/>
+          <w:lang w:eastAsia="en-IN" w:bidi="ar-SA"/>
+          <w14:ligatures w14:val="none"/>
+        </w:rPr>
+      </w:pPr>
+      <w:r>
+        <w:rPr>
+          <w:rFonts w:ascii="Courier New" w:eastAsia="Times New Roman" w:hAnsi="Courier New" w:cs="Courier New"/>
+          <w:kern w:val="0"/>
+          <w:sz w:val="20"/>
+          <w:szCs w:val="20"/>
+          <w:lang w:eastAsia="en-IN" w:bidi="ar-SA"/>
+          <w14:ligatures w14:val="none"/>
+        </w:rPr>
+        <w:t xml:space="preserve">      =</w:t>
+      </w:r>
+    </w:p>
+    <w:p>
+      <w:pPr>
+        <w:tabs>
+          <w:tab w:val="left" w:pos="916"/>
+          <w:tab w:val="left" w:pos="1832"/>
+          <w:tab w:val="left" w:pos="2748"/>
+          <w:tab w:val="left" w:pos="3664"/>
+          <w:tab w:val="left" w:pos="4580"/>
+          <w:tab w:val="left" w:pos="5496"/>
+          <w:tab w:val="left" w:pos="6412"/>
+          <w:tab w:val="left" w:pos="7328"/>
+          <w:tab w:val="left" w:pos="8244"/>
+          <w:tab w:val="left" w:pos="9160"/>
+          <w:tab w:val="left" w:pos="10076"/>
+          <w:tab w:val="left" w:pos="10992"/>
+          <w:tab w:val="left" w:pos="11908"/>
+          <w:tab w:val="left" w:pos="12824"/>
+          <w:tab w:val="left" w:pos="13740"/>
+          <w:tab w:val="left" w:pos="14656"/>
+        </w:tabs>
+        <w:spacing w:after="0" w:line="300" w:lineRule="atLeast"/>
+        <w:rPr>
+          <w:rFonts w:ascii="Courier New" w:eastAsia="Times New Roman" w:hAnsi="Courier New" w:cs="Courier New"/>
+          <w:kern w:val="0"/>
+          <w:sz w:val="20"/>
+          <w:szCs w:val="20"/>
+          <w:lang w:eastAsia="en-IN" w:bidi="ar-SA"/>
+          <w14:ligatures w14:val="none"/>
+        </w:rPr>
+      </w:pPr>
+      <w:r>
+        <w:rPr>
+          <w:rFonts w:ascii="Courier New" w:eastAsia="Times New Roman" w:hAnsi="Courier New" w:cs="Courier New"/>
+          <w:kern w:val="0"/>
+          <w:sz w:val="20"/>
+          <w:szCs w:val="20"/>
+          <w:lang w:eastAsia="en-IN" w:bidi="ar-SA"/>
+          <w14:ligatures w14:val="none"/>
+        </w:rPr>
+        <w:t>Random Forest</w:t>
+      </w:r>
+    </w:p>
+    <w:p>
+      <w:pPr>
+        <w:spacing w:after="0" w:line="300" w:lineRule="atLeast"/>
+        <w:rPr>
+          <w:rFonts w:ascii="Segoe UI" w:eastAsia="Times New Roman" w:hAnsi="Segoe UI" w:cs="Segoe UI"/>
+          <w:kern w:val="0"/>
+          <w:sz w:val="21"/>
+          <w:szCs w:val="21"/>
+          <w:lang w:eastAsia="en-IN" w:bidi="ar-SA"/>
+          <w14:ligatures w14:val="none"/>
+        </w:rPr>
+      </w:pPr>
+      <w:r>
+        <w:rPr>
+          <w:rFonts w:ascii="Segoe UI" w:eastAsia="Times New Roman" w:hAnsi="Segoe UI" w:cs="Segoe UI"/>
+          <w:kern w:val="0"/>
+          <w:sz w:val="21"/>
+          <w:szCs w:val="21"/>
+          <w:lang w:eastAsia="en-IN" w:bidi="ar-SA"/>
+          <w14:ligatures w14:val="none"/>
+        </w:rPr>
+        <w:pict w14:anchorId="1992AEA6">
+          <v:rect id="_x0000_i1108" style="width:0;height:1.5pt" o:hralign="center" o:hrstd="t" o:hr="t" fillcolor="#a0a0a0" stroked="f"/>
+        </w:pict>
+      </w:r>
+    </w:p>
+    <w:p>
+      <w:pPr>
+        <w:spacing w:before="100" w:beforeAutospacing="1" w:after="100" w:afterAutospacing="1" w:line="300" w:lineRule="atLeast"/>
+        <w:outlineLvl w:val="0"/>
+        <w:rPr>
+          <w:rFonts w:ascii="Segoe UI" w:eastAsia="Times New Roman" w:hAnsi="Segoe UI" w:cs="Segoe UI"/>
+          <w:b/>
+          <w:bCs/>
+          <w:kern w:val="36"/>
+          <w:sz w:val="48"/>
+          <w:szCs w:val="48"/>
+          <w:lang w:eastAsia="en-IN" w:bidi="ar-SA"/>
+          <w14:ligatures w14:val="none"/>
+        </w:rPr>
+      </w:pPr>
+      <w:r>
+        <w:rPr>
+          <w:rFonts w:ascii="Segoe UI" w:eastAsia="Times New Roman" w:hAnsi="Segoe UI" w:cs="Segoe UI"/>
+          <w:b/>
+          <w:bCs/>
+          <w:kern w:val="36"/>
+          <w:sz w:val="48"/>
+          <w:szCs w:val="48"/>
+          <w:lang w:eastAsia="en-IN" w:bidi="ar-SA"/>
+          <w14:ligatures w14:val="none"/>
+        </w:rPr>
+        <w:t>Bagging vs Boosting</w:t>
+      </w:r>
+    </w:p>
+    <w:tbl>
+      <w:tblPr>
+        <w:tblW w:w="0" w:type="auto"/>
+        <w:tblCellSpacing w:w="15" w:type="dxa"/>
+        <w:tblCellMar>
+          <w:top w:w="15" w:type="dxa"/>
+          <w:left w:w="15" w:type="dxa"/>
+          <w:bottom w:w="15" w:type="dxa"/>
+          <w:right w:w="15" w:type="dxa"/>
+        </w:tblCellMar>
+        <w:tblLook w:val="04A0" w:firstRow="1" w:lastRow="0" w:firstColumn="1" w:lastColumn="0" w:noHBand="0" w:noVBand="1"/>
+      </w:tblPr>
+      <w:tblGrid>
+        <w:gridCol w:w="1778"/>
+        <w:gridCol w:w="1897"/>
+        <w:gridCol w:w="2485"/>
+      </w:tblGrid>
+      <w:tr>
+        <w:trPr>
+          <w:tblCellSpacing w:w="15" w:type="dxa"/>
+        </w:trPr>
+        <w:tc>
+          <w:tcPr>
+            <w:tcW w:w="0" w:type="auto"/>
+            <w:tcBorders>
+              <w:top w:val="single" w:sz="6" w:space="0" w:color="E6E6E6"/>
+              <w:left w:val="single" w:sz="6" w:space="0" w:color="E6E6E6"/>
+              <w:bottom w:val="single" w:sz="6" w:space="0" w:color="E6E6E6"/>
+              <w:right w:val="single" w:sz="6" w:space="0" w:color="E6E6E6"/>
+            </w:tcBorders>
+            <w:shd w:val="clear" w:color="auto" w:fill="F5F5F5"/>
+            <w:vAlign w:val="center"/>
+            <w:hideMark/>
+          </w:tcPr>
+          <w:p>
+            <w:pPr>
+              <w:spacing w:after="0" w:line="240" w:lineRule="auto"/>
+              <w:jc w:val="center"/>
+              <w:rPr>
+                <w:rFonts w:ascii="Times New Roman" w:eastAsia="Times New Roman" w:hAnsi="Times New Roman" w:cs="Times New Roman"/>
+                <w:b/>
+                <w:bCs/>
+                <w:kern w:val="0"/>
+                <w:sz w:val="24"/>
+                <w:szCs w:val="24"/>
+                <w:lang w:eastAsia="en-IN" w:bidi="ar-SA"/>
+                <w14:ligatures w14:val="none"/>
+              </w:rPr>
+            </w:pPr>
+            <w:r>
+              <w:rPr>
+                <w:rFonts w:ascii="Times New Roman" w:eastAsia="Times New Roman" w:hAnsi="Times New Roman" w:cs="Times New Roman"/>
+                <w:b/>
+                <w:bCs/>
+                <w:kern w:val="0"/>
+                <w:sz w:val="24"/>
+                <w:szCs w:val="24"/>
+                <w:lang w:eastAsia="en-IN" w:bidi="ar-SA"/>
+                <w14:ligatures w14:val="none"/>
+              </w:rPr>
+              <w:t>Feature</w:t>
+            </w:r>
+          </w:p>
+        </w:tc>
+        <w:tc>
+          <w:tcPr>
+            <w:tcW w:w="0" w:type="auto"/>
+            <w:tcBorders>
+              <w:top w:val="single" w:sz="6" w:space="0" w:color="E6E6E6"/>
+              <w:left w:val="single" w:sz="6" w:space="0" w:color="E6E6E6"/>
+              <w:bottom w:val="single" w:sz="6" w:space="0" w:color="E6E6E6"/>
+              <w:right w:val="single" w:sz="6" w:space="0" w:color="E6E6E6"/>
+            </w:tcBorders>
+            <w:shd w:val="clear" w:color="auto" w:fill="F5F5F5"/>
+            <w:vAlign w:val="center"/>
+            <w:hideMark/>
+          </w:tcPr>
+          <w:p>
+            <w:pPr>
+              <w:spacing w:after="0" w:line="240" w:lineRule="auto"/>
+              <w:jc w:val="center"/>
+              <w:rPr>
+                <w:rFonts w:ascii="Times New Roman" w:eastAsia="Times New Roman" w:hAnsi="Times New Roman" w:cs="Times New Roman"/>
+                <w:b/>
+                <w:bCs/>
+                <w:kern w:val="0"/>
+                <w:sz w:val="24"/>
+                <w:szCs w:val="24"/>
+                <w:lang w:eastAsia="en-IN" w:bidi="ar-SA"/>
+                <w14:ligatures w14:val="none"/>
+              </w:rPr>
+            </w:pPr>
+            <w:r>
+              <w:rPr>
+                <w:rFonts w:ascii="Times New Roman" w:eastAsia="Times New Roman" w:hAnsi="Times New Roman" w:cs="Times New Roman"/>
+                <w:b/>
+                <w:bCs/>
+                <w:kern w:val="0"/>
+                <w:sz w:val="24"/>
+                <w:szCs w:val="24"/>
+                <w:lang w:eastAsia="en-IN" w:bidi="ar-SA"/>
+                <w14:ligatures w14:val="none"/>
+              </w:rPr>
+              <w:t>Bagging</w:t>
+            </w:r>
+          </w:p>
+        </w:tc>
+        <w:tc>
+          <w:tcPr>
+            <w:tcW w:w="0" w:type="auto"/>
+            <w:tcBorders>
+              <w:top w:val="single" w:sz="6" w:space="0" w:color="E6E6E6"/>
+              <w:left w:val="single" w:sz="6" w:space="0" w:color="E6E6E6"/>
+              <w:bottom w:val="single" w:sz="6" w:space="0" w:color="E6E6E6"/>
+              <w:right w:val="single" w:sz="6" w:space="0" w:color="E6E6E6"/>
+            </w:tcBorders>
+            <w:shd w:val="clear" w:color="auto" w:fill="F5F5F5"/>
+            <w:vAlign w:val="center"/>
+            <w:hideMark/>
+          </w:tcPr>
+          <w:p>
+            <w:pPr>
+              <w:spacing w:after="0" w:line="240" w:lineRule="auto"/>
+              <w:jc w:val="center"/>
+              <w:rPr>
+                <w:rFonts w:ascii="Times New Roman" w:eastAsia="Times New Roman" w:hAnsi="Times New Roman" w:cs="Times New Roman"/>
+                <w:b/>
+                <w:bCs/>
+                <w:kern w:val="0"/>
+                <w:sz w:val="24"/>
+                <w:szCs w:val="24"/>
+                <w:lang w:eastAsia="en-IN" w:bidi="ar-SA"/>
+                <w14:ligatures w14:val="none"/>
+              </w:rPr>
+            </w:pPr>
+            <w:r>
+              <w:rPr>
+                <w:rFonts w:ascii="Times New Roman" w:eastAsia="Times New Roman" w:hAnsi="Times New Roman" w:cs="Times New Roman"/>
+                <w:b/>
+                <w:bCs/>
+                <w:kern w:val="0"/>
+                <w:sz w:val="24"/>
+                <w:szCs w:val="24"/>
+                <w:lang w:eastAsia="en-IN" w:bidi="ar-SA"/>
+                <w14:ligatures w14:val="none"/>
+              </w:rPr>
+              <w:t>Boosting</w:t>
+            </w:r>
+          </w:p>
+        </w:tc>
+      </w:tr>
+      <w:tr>
+        <w:trPr>
+          <w:tblCellSpacing w:w="15" w:type="dxa"/>
+        </w:trPr>
+        <w:tc>
+          <w:tcPr>
+            <w:tcW w:w="0" w:type="auto"/>
+            <w:tcBorders>
+              <w:top w:val="single" w:sz="6" w:space="0" w:color="E6E6E6"/>
+              <w:left w:val="single" w:sz="6" w:space="0" w:color="E6E6E6"/>
+              <w:bottom w:val="single" w:sz="6" w:space="0" w:color="E6E6E6"/>
+              <w:right w:val="single" w:sz="6" w:space="0" w:color="E6E6E6"/>
+            </w:tcBorders>
+            <w:vAlign w:val="center"/>
+            <w:hideMark/>
+          </w:tcPr>
+          <w:p>
+            <w:pPr>
+              <w:spacing w:after="0" w:line="240" w:lineRule="auto"/>
+              <w:rPr>
+                <w:rFonts w:ascii="Times New Roman" w:eastAsia="Times New Roman" w:hAnsi="Times New Roman" w:cs="Times New Roman"/>
+                <w:kern w:val="0"/>
+                <w:sz w:val="24"/>
+                <w:szCs w:val="24"/>
+                <w:lang w:eastAsia="en-IN" w:bidi="ar-SA"/>
+                <w14:ligatures w14:val="none"/>
+              </w:rPr>
+            </w:pPr>
+            <w:r>
+              <w:rPr>
+                <w:rFonts w:ascii="Times New Roman" w:eastAsia="Times New Roman" w:hAnsi="Times New Roman" w:cs="Times New Roman"/>
+                <w:kern w:val="0"/>
+                <w:sz w:val="24"/>
+                <w:szCs w:val="24"/>
+                <w:lang w:eastAsia="en-IN" w:bidi="ar-SA"/>
+                <w14:ligatures w14:val="none"/>
+              </w:rPr>
+              <w:t>Training</w:t>
+            </w:r>
+          </w:p>
+        </w:tc>
+        <w:tc>
+          <w:tcPr>
+            <w:tcW w:w="0" w:type="auto"/>
+            <w:tcBorders>
+              <w:top w:val="single" w:sz="6" w:space="0" w:color="E6E6E6"/>
+              <w:left w:val="single" w:sz="6" w:space="0" w:color="E6E6E6"/>
+              <w:bottom w:val="single" w:sz="6" w:space="0" w:color="E6E6E6"/>
+              <w:right w:val="single" w:sz="6" w:space="0" w:color="E6E6E6"/>
+            </w:tcBorders>
+            <w:vAlign w:val="center"/>
+            <w:hideMark/>
+          </w:tcPr>
+          <w:p>
+            <w:pPr>
+              <w:spacing w:after="0" w:line="240" w:lineRule="auto"/>
+              <w:rPr>
+                <w:rFonts w:ascii="Times New Roman" w:eastAsia="Times New Roman" w:hAnsi="Times New Roman" w:cs="Times New Roman"/>
+                <w:kern w:val="0"/>
+                <w:sz w:val="24"/>
+                <w:szCs w:val="24"/>
+                <w:lang w:eastAsia="en-IN" w:bidi="ar-SA"/>
+                <w14:ligatures w14:val="none"/>
+              </w:rPr>
+            </w:pPr>
+            <w:r>
+              <w:rPr>
+                <w:rFonts w:ascii="Times New Roman" w:eastAsia="Times New Roman" w:hAnsi="Times New Roman" w:cs="Times New Roman"/>
+                <w:kern w:val="0"/>
+                <w:sz w:val="24"/>
+                <w:szCs w:val="24"/>
+                <w:lang w:eastAsia="en-IN" w:bidi="ar-SA"/>
+                <w14:ligatures w14:val="none"/>
+              </w:rPr>
+              <w:t>Parallel</w:t>
+            </w:r>
+          </w:p>
+        </w:tc>
+        <w:tc>
+          <w:tcPr>
+            <w:tcW w:w="0" w:type="auto"/>
+            <w:tcBorders>
+              <w:top w:val="single" w:sz="6" w:space="0" w:color="E6E6E6"/>
+              <w:left w:val="single" w:sz="6" w:space="0" w:color="E6E6E6"/>
+              <w:bottom w:val="single" w:sz="6" w:space="0" w:color="E6E6E6"/>
+              <w:right w:val="single" w:sz="6" w:space="0" w:color="E6E6E6"/>
+            </w:tcBorders>
+            <w:vAlign w:val="center"/>
+            <w:hideMark/>
+          </w:tcPr>
+          <w:p>
+            <w:pPr>
+              <w:spacing w:after="0" w:line="240" w:lineRule="auto"/>
+              <w:rPr>
+                <w:rFonts w:ascii="Times New Roman" w:eastAsia="Times New Roman" w:hAnsi="Times New Roman" w:cs="Times New Roman"/>
+                <w:kern w:val="0"/>
+                <w:sz w:val="24"/>
+                <w:szCs w:val="24"/>
+                <w:lang w:eastAsia="en-IN" w:bidi="ar-SA"/>
+                <w14:ligatures w14:val="none"/>
+              </w:rPr>
+            </w:pPr>
+            <w:r>
+              <w:rPr>
+                <w:rFonts w:ascii="Times New Roman" w:eastAsia="Times New Roman" w:hAnsi="Times New Roman" w:cs="Times New Roman"/>
+                <w:kern w:val="0"/>
+                <w:sz w:val="24"/>
+                <w:szCs w:val="24"/>
+                <w:lang w:eastAsia="en-IN" w:bidi="ar-SA"/>
+                <w14:ligatures w14:val="none"/>
+              </w:rPr>
+              <w:t>Sequential</w:t>
+            </w:r>
+          </w:p>
+        </w:tc>
+      </w:tr>
+      <w:tr>
+        <w:trPr>
+          <w:tblCellSpacing w:w="15" w:type="dxa"/>
+        </w:trPr>
+        <w:tc>
+          <w:tcPr>
+            <w:tcW w:w="0" w:type="auto"/>
+            <w:tcBorders>
+              <w:top w:val="single" w:sz="6" w:space="0" w:color="E6E6E6"/>
+              <w:left w:val="single" w:sz="6" w:space="0" w:color="E6E6E6"/>
+              <w:bottom w:val="single" w:sz="6" w:space="0" w:color="E6E6E6"/>
+              <w:right w:val="single" w:sz="6" w:space="0" w:color="E6E6E6"/>
+            </w:tcBorders>
+            <w:vAlign w:val="center"/>
+            <w:hideMark/>
+          </w:tcPr>
+          <w:p>
+            <w:pPr>
+              <w:spacing w:after="0" w:line="240" w:lineRule="auto"/>
+              <w:rPr>
+                <w:rFonts w:ascii="Times New Roman" w:eastAsia="Times New Roman" w:hAnsi="Times New Roman" w:cs="Times New Roman"/>
+                <w:kern w:val="0"/>
+                <w:sz w:val="24"/>
+                <w:szCs w:val="24"/>
+                <w:lang w:eastAsia="en-IN" w:bidi="ar-SA"/>
+                <w14:ligatures w14:val="none"/>
+              </w:rPr>
+            </w:pPr>
+            <w:r>
+              <w:rPr>
+                <w:rFonts w:ascii="Times New Roman" w:eastAsia="Times New Roman" w:hAnsi="Times New Roman" w:cs="Times New Roman"/>
+                <w:kern w:val="0"/>
+                <w:sz w:val="24"/>
+                <w:szCs w:val="24"/>
+                <w:lang w:eastAsia="en-IN" w:bidi="ar-SA"/>
+                <w14:ligatures w14:val="none"/>
+              </w:rPr>
+              <w:t>Goal</w:t>
+            </w:r>
+          </w:p>
+        </w:tc>
+        <w:tc>
+          <w:tcPr>
+            <w:tcW w:w="0" w:type="auto"/>
+            <w:tcBorders>
+              <w:top w:val="single" w:sz="6" w:space="0" w:color="E6E6E6"/>
+              <w:left w:val="single" w:sz="6" w:space="0" w:color="E6E6E6"/>
+              <w:bottom w:val="single" w:sz="6" w:space="0" w:color="E6E6E6"/>
+              <w:right w:val="single" w:sz="6" w:space="0" w:color="E6E6E6"/>
+            </w:tcBorders>
+            <w:vAlign w:val="center"/>
+            <w:hideMark/>
+          </w:tcPr>
+          <w:p>
+            <w:pPr>
+              <w:spacing w:after="0" w:line="240" w:lineRule="auto"/>
+              <w:rPr>
+                <w:rFonts w:ascii="Times New Roman" w:eastAsia="Times New Roman" w:hAnsi="Times New Roman" w:cs="Times New Roman"/>
+                <w:kern w:val="0"/>
+                <w:sz w:val="24"/>
+                <w:szCs w:val="24"/>
+                <w:lang w:eastAsia="en-IN" w:bidi="ar-SA"/>
+                <w14:ligatures w14:val="none"/>
+              </w:rPr>
+            </w:pPr>
+            <w:r>
+              <w:rPr>
+                <w:rFonts w:ascii="Times New Roman" w:eastAsia="Times New Roman" w:hAnsi="Times New Roman" w:cs="Times New Roman"/>
+                <w:kern w:val="0"/>
+                <w:sz w:val="24"/>
+                <w:szCs w:val="24"/>
+                <w:lang w:eastAsia="en-IN" w:bidi="ar-SA"/>
+                <w14:ligatures w14:val="none"/>
+              </w:rPr>
+              <w:t>Reduce Variance</w:t>
+            </w:r>
+          </w:p>
+        </w:tc>
+        <w:tc>
+          <w:tcPr>
+            <w:tcW w:w="0" w:type="auto"/>
+            <w:tcBorders>
+              <w:top w:val="single" w:sz="6" w:space="0" w:color="E6E6E6"/>
+              <w:left w:val="single" w:sz="6" w:space="0" w:color="E6E6E6"/>
+              <w:bottom w:val="single" w:sz="6" w:space="0" w:color="E6E6E6"/>
+              <w:right w:val="single" w:sz="6" w:space="0" w:color="E6E6E6"/>
+            </w:tcBorders>
+            <w:vAlign w:val="center"/>
+            <w:hideMark/>
+          </w:tcPr>
+          <w:p>
+            <w:pPr>
+              <w:spacing w:after="0" w:line="240" w:lineRule="auto"/>
+              <w:rPr>
+                <w:rFonts w:ascii="Times New Roman" w:eastAsia="Times New Roman" w:hAnsi="Times New Roman" w:cs="Times New Roman"/>
+                <w:kern w:val="0"/>
+                <w:sz w:val="24"/>
+                <w:szCs w:val="24"/>
+                <w:lang w:eastAsia="en-IN" w:bidi="ar-SA"/>
+                <w14:ligatures w14:val="none"/>
+              </w:rPr>
+            </w:pPr>
+            <w:r>
+              <w:rPr>
+                <w:rFonts w:ascii="Times New Roman" w:eastAsia="Times New Roman" w:hAnsi="Times New Roman" w:cs="Times New Roman"/>
+                <w:kern w:val="0"/>
+                <w:sz w:val="24"/>
+                <w:szCs w:val="24"/>
+                <w:lang w:eastAsia="en-IN" w:bidi="ar-SA"/>
+                <w14:ligatures w14:val="none"/>
+              </w:rPr>
+              <w:t>Reduce Bias</w:t>
+            </w:r>
+          </w:p>
+        </w:tc>
+      </w:tr>
+      <w:tr>
+        <w:trPr>
+          <w:tblCellSpacing w:w="15" w:type="dxa"/>
+        </w:trPr>
+        <w:tc>
+          <w:tcPr>
+            <w:tcW w:w="0" w:type="auto"/>
+            <w:tcBorders>
+              <w:top w:val="single" w:sz="6" w:space="0" w:color="E6E6E6"/>
+              <w:left w:val="single" w:sz="6" w:space="0" w:color="E6E6E6"/>
+              <w:bottom w:val="single" w:sz="6" w:space="0" w:color="E6E6E6"/>
+              <w:right w:val="single" w:sz="6" w:space="0" w:color="E6E6E6"/>
+            </w:tcBorders>
+            <w:vAlign w:val="center"/>
+            <w:hideMark/>
+          </w:tcPr>
+          <w:p>
+            <w:pPr>
+              <w:spacing w:after="0" w:line="240" w:lineRule="auto"/>
+              <w:rPr>
+                <w:rFonts w:ascii="Times New Roman" w:eastAsia="Times New Roman" w:hAnsi="Times New Roman" w:cs="Times New Roman"/>
+                <w:kern w:val="0"/>
+                <w:sz w:val="24"/>
+                <w:szCs w:val="24"/>
+                <w:lang w:eastAsia="en-IN" w:bidi="ar-SA"/>
+                <w14:ligatures w14:val="none"/>
+              </w:rPr>
+            </w:pPr>
+            <w:r>
+              <w:rPr>
+                <w:rFonts w:ascii="Times New Roman" w:eastAsia="Times New Roman" w:hAnsi="Times New Roman" w:cs="Times New Roman"/>
+                <w:kern w:val="0"/>
+                <w:sz w:val="24"/>
+                <w:szCs w:val="24"/>
+                <w:lang w:eastAsia="en-IN" w:bidi="ar-SA"/>
+                <w14:ligatures w14:val="none"/>
+              </w:rPr>
+              <w:t>Sample Selection</w:t>
+            </w:r>
+          </w:p>
+        </w:tc>
+        <w:tc>
+          <w:tcPr>
+            <w:tcW w:w="0" w:type="auto"/>
+            <w:tcBorders>
+              <w:top w:val="single" w:sz="6" w:space="0" w:color="E6E6E6"/>
+              <w:left w:val="single" w:sz="6" w:space="0" w:color="E6E6E6"/>
+              <w:bottom w:val="single" w:sz="6" w:space="0" w:color="E6E6E6"/>
+              <w:right w:val="single" w:sz="6" w:space="0" w:color="E6E6E6"/>
+            </w:tcBorders>
+            <w:vAlign w:val="center"/>
+            <w:hideMark/>
+          </w:tcPr>
+          <w:p>
+            <w:pPr>
+              <w:spacing w:after="0" w:line="240" w:lineRule="auto"/>
+              <w:rPr>
+                <w:rFonts w:ascii="Times New Roman" w:eastAsia="Times New Roman" w:hAnsi="Times New Roman" w:cs="Times New Roman"/>
+                <w:kern w:val="0"/>
+                <w:sz w:val="24"/>
+                <w:szCs w:val="24"/>
+                <w:lang w:eastAsia="en-IN" w:bidi="ar-SA"/>
+                <w14:ligatures w14:val="none"/>
+              </w:rPr>
+            </w:pPr>
+            <w:r>
+              <w:rPr>
+                <w:rFonts w:ascii="Times New Roman" w:eastAsia="Times New Roman" w:hAnsi="Times New Roman" w:cs="Times New Roman"/>
+                <w:kern w:val="0"/>
+                <w:sz w:val="24"/>
+                <w:szCs w:val="24"/>
+                <w:lang w:eastAsia="en-IN" w:bidi="ar-SA"/>
+                <w14:ligatures w14:val="none"/>
+              </w:rPr>
+              <w:t>Random Bootstrap</w:t>
+            </w:r>
+          </w:p>
+        </w:tc>
+        <w:tc>
+          <w:tcPr>
+            <w:tcW w:w="0" w:type="auto"/>
+            <w:tcBorders>
+              <w:top w:val="single" w:sz="6" w:space="0" w:color="E6E6E6"/>
+              <w:left w:val="single" w:sz="6" w:space="0" w:color="E6E6E6"/>
+              <w:bottom w:val="single" w:sz="6" w:space="0" w:color="E6E6E6"/>
+              <w:right w:val="single" w:sz="6" w:space="0" w:color="E6E6E6"/>
+            </w:tcBorders>
+            <w:vAlign w:val="center"/>
+            <w:hideMark/>
+          </w:tcPr>
+          <w:p>
+            <w:pPr>
+              <w:spacing w:after="0" w:line="240" w:lineRule="auto"/>
+              <w:rPr>
+                <w:rFonts w:ascii="Times New Roman" w:eastAsia="Times New Roman" w:hAnsi="Times New Roman" w:cs="Times New Roman"/>
+                <w:kern w:val="0"/>
+                <w:sz w:val="24"/>
+                <w:szCs w:val="24"/>
+                <w:lang w:eastAsia="en-IN" w:bidi="ar-SA"/>
+                <w14:ligatures w14:val="none"/>
+              </w:rPr>
+            </w:pPr>
+            <w:r>
+              <w:rPr>
+                <w:rFonts w:ascii="Times New Roman" w:eastAsia="Times New Roman" w:hAnsi="Times New Roman" w:cs="Times New Roman"/>
+                <w:kern w:val="0"/>
+                <w:sz w:val="24"/>
+                <w:szCs w:val="24"/>
+                <w:lang w:eastAsia="en-IN" w:bidi="ar-SA"/>
+                <w14:ligatures w14:val="none"/>
+              </w:rPr>
+              <w:t>Focus on previous errors</w:t>
+            </w:r>
+          </w:p>
+        </w:tc>
+      </w:tr>
+      <w:tr>
+        <w:trPr>
+          <w:tblCellSpacing w:w="15" w:type="dxa"/>
+        </w:trPr>
+        <w:tc>
+          <w:tcPr>
+            <w:tcW w:w="0" w:type="auto"/>
+            <w:tcBorders>
+              <w:top w:val="single" w:sz="6" w:space="0" w:color="E6E6E6"/>
+              <w:left w:val="single" w:sz="6" w:space="0" w:color="E6E6E6"/>
+              <w:bottom w:val="single" w:sz="6" w:space="0" w:color="E6E6E6"/>
+              <w:right w:val="single" w:sz="6" w:space="0" w:color="E6E6E6"/>
+            </w:tcBorders>
+            <w:vAlign w:val="center"/>
+            <w:hideMark/>
+          </w:tcPr>
+          <w:p>
+            <w:pPr>
+              <w:spacing w:after="0" w:line="240" w:lineRule="auto"/>
+              <w:rPr>
+                <w:rFonts w:ascii="Times New Roman" w:eastAsia="Times New Roman" w:hAnsi="Times New Roman" w:cs="Times New Roman"/>
+                <w:kern w:val="0"/>
+                <w:sz w:val="24"/>
+                <w:szCs w:val="24"/>
+                <w:lang w:eastAsia="en-IN" w:bidi="ar-SA"/>
+                <w14:ligatures w14:val="none"/>
+              </w:rPr>
+            </w:pPr>
+            <w:r>
+              <w:rPr>
+                <w:rFonts w:ascii="Times New Roman" w:eastAsia="Times New Roman" w:hAnsi="Times New Roman" w:cs="Times New Roman"/>
+                <w:kern w:val="0"/>
+                <w:sz w:val="24"/>
+                <w:szCs w:val="24"/>
+                <w:lang w:eastAsia="en-IN" w:bidi="ar-SA"/>
+                <w14:ligatures w14:val="none"/>
+              </w:rPr>
+              <w:t>Overfitting</w:t>
+            </w:r>
+          </w:p>
+        </w:tc>
+        <w:tc>
+          <w:tcPr>
+            <w:tcW w:w="0" w:type="auto"/>
+            <w:tcBorders>
+              <w:top w:val="single" w:sz="6" w:space="0" w:color="E6E6E6"/>
+              <w:left w:val="single" w:sz="6" w:space="0" w:color="E6E6E6"/>
+              <w:bottom w:val="single" w:sz="6" w:space="0" w:color="E6E6E6"/>
+              <w:right w:val="single" w:sz="6" w:space="0" w:color="E6E6E6"/>
+            </w:tcBorders>
+            <w:vAlign w:val="center"/>
+            <w:hideMark/>
+          </w:tcPr>
+          <w:p>
+            <w:pPr>
+              <w:spacing w:after="0" w:line="240" w:lineRule="auto"/>
+              <w:rPr>
+                <w:rFonts w:ascii="Times New Roman" w:eastAsia="Times New Roman" w:hAnsi="Times New Roman" w:cs="Times New Roman"/>
+                <w:kern w:val="0"/>
+                <w:sz w:val="24"/>
+                <w:szCs w:val="24"/>
+                <w:lang w:eastAsia="en-IN" w:bidi="ar-SA"/>
+                <w14:ligatures w14:val="none"/>
+              </w:rPr>
+            </w:pPr>
+            <w:r>
+              <w:rPr>
+                <w:rFonts w:ascii="Times New Roman" w:eastAsia="Times New Roman" w:hAnsi="Times New Roman" w:cs="Times New Roman"/>
+                <w:kern w:val="0"/>
+                <w:sz w:val="24"/>
+                <w:szCs w:val="24"/>
+                <w:lang w:eastAsia="en-IN" w:bidi="ar-SA"/>
+                <w14:ligatures w14:val="none"/>
+              </w:rPr>
+              <w:t>Less Likely</w:t>
+            </w:r>
+          </w:p>
+        </w:tc>
+        <w:tc>
+          <w:tcPr>
+            <w:tcW w:w="0" w:type="auto"/>
+            <w:tcBorders>
+              <w:top w:val="single" w:sz="6" w:space="0" w:color="E6E6E6"/>
+              <w:left w:val="single" w:sz="6" w:space="0" w:color="E6E6E6"/>
+              <w:bottom w:val="single" w:sz="6" w:space="0" w:color="E6E6E6"/>
+              <w:right w:val="single" w:sz="6" w:space="0" w:color="E6E6E6"/>
+            </w:tcBorders>
+            <w:vAlign w:val="center"/>
+            <w:hideMark/>
+          </w:tcPr>
+          <w:p>
+            <w:pPr>
+              <w:spacing w:after="0" w:line="240" w:lineRule="auto"/>
+              <w:rPr>
+                <w:rFonts w:ascii="Times New Roman" w:eastAsia="Times New Roman" w:hAnsi="Times New Roman" w:cs="Times New Roman"/>
+                <w:kern w:val="0"/>
+                <w:sz w:val="24"/>
+                <w:szCs w:val="24"/>
+                <w:lang w:eastAsia="en-IN" w:bidi="ar-SA"/>
+                <w14:ligatures w14:val="none"/>
+              </w:rPr>
+            </w:pPr>
+            <w:r>
+              <w:rPr>
+                <w:rFonts w:ascii="Times New Roman" w:eastAsia="Times New Roman" w:hAnsi="Times New Roman" w:cs="Times New Roman"/>
+                <w:kern w:val="0"/>
+                <w:sz w:val="24"/>
+                <w:szCs w:val="24"/>
+                <w:lang w:eastAsia="en-IN" w:bidi="ar-SA"/>
+                <w14:ligatures w14:val="none"/>
+              </w:rPr>
+              <w:t>More Likely</w:t>
+            </w:r>
+          </w:p>
+        </w:tc>
+      </w:tr>
+      <w:tr>
+        <w:trPr>
+          <w:tblCellSpacing w:w="15" w:type="dxa"/>
+        </w:trPr>
+        <w:tc>
+          <w:tcPr>
+            <w:tcW w:w="0" w:type="auto"/>
+            <w:tcBorders>
+              <w:top w:val="single" w:sz="6" w:space="0" w:color="E6E6E6"/>
+              <w:left w:val="single" w:sz="6" w:space="0" w:color="E6E6E6"/>
+              <w:bottom w:val="single" w:sz="6" w:space="0" w:color="E6E6E6"/>
+              <w:right w:val="single" w:sz="6" w:space="0" w:color="E6E6E6"/>
+            </w:tcBorders>
+            <w:vAlign w:val="center"/>
+            <w:hideMark/>
+          </w:tcPr>
+          <w:p>
+            <w:pPr>
+              <w:spacing w:after="0" w:line="240" w:lineRule="auto"/>
+              <w:rPr>
+                <w:rFonts w:ascii="Times New Roman" w:eastAsia="Times New Roman" w:hAnsi="Times New Roman" w:cs="Times New Roman"/>
+                <w:kern w:val="0"/>
+                <w:sz w:val="24"/>
+                <w:szCs w:val="24"/>
+                <w:lang w:eastAsia="en-IN" w:bidi="ar-SA"/>
+                <w14:ligatures w14:val="none"/>
+              </w:rPr>
+            </w:pPr>
+            <w:r>
+              <w:rPr>
+                <w:rFonts w:ascii="Times New Roman" w:eastAsia="Times New Roman" w:hAnsi="Times New Roman" w:cs="Times New Roman"/>
+                <w:kern w:val="0"/>
+                <w:sz w:val="24"/>
+                <w:szCs w:val="24"/>
+                <w:lang w:eastAsia="en-IN" w:bidi="ar-SA"/>
+                <w14:ligatures w14:val="none"/>
+              </w:rPr>
+              <w:t>Example</w:t>
+            </w:r>
+          </w:p>
+        </w:tc>
+        <w:tc>
+          <w:tcPr>
+            <w:tcW w:w="0" w:type="auto"/>
+            <w:tcBorders>
+              <w:top w:val="single" w:sz="6" w:space="0" w:color="E6E6E6"/>
+              <w:left w:val="single" w:sz="6" w:space="0" w:color="E6E6E6"/>
+              <w:bottom w:val="single" w:sz="6" w:space="0" w:color="E6E6E6"/>
+              <w:right w:val="single" w:sz="6" w:space="0" w:color="E6E6E6"/>
+            </w:tcBorders>
+            <w:vAlign w:val="center"/>
+            <w:hideMark/>
+          </w:tcPr>
+          <w:p>
+            <w:pPr>
+              <w:spacing w:after="0" w:line="240" w:lineRule="auto"/>
+              <w:rPr>
+                <w:rFonts w:ascii="Times New Roman" w:eastAsia="Times New Roman" w:hAnsi="Times New Roman" w:cs="Times New Roman"/>
+                <w:kern w:val="0"/>
+                <w:sz w:val="24"/>
+                <w:szCs w:val="24"/>
+                <w:lang w:eastAsia="en-IN" w:bidi="ar-SA"/>
+                <w14:ligatures w14:val="none"/>
+              </w:rPr>
+            </w:pPr>
+            <w:r>
+              <w:rPr>
+                <w:rFonts w:ascii="Times New Roman" w:eastAsia="Times New Roman" w:hAnsi="Times New Roman" w:cs="Times New Roman"/>
+                <w:kern w:val="0"/>
+                <w:sz w:val="24"/>
+                <w:szCs w:val="24"/>
+                <w:lang w:eastAsia="en-IN" w:bidi="ar-SA"/>
+                <w14:ligatures w14:val="none"/>
+              </w:rPr>
+              <w:t>Random Forest</w:t>
+            </w:r>
+          </w:p>
+        </w:tc>
+        <w:tc>
+          <w:tcPr>
+            <w:tcW w:w="0" w:type="auto"/>
+            <w:tcBorders>
+              <w:top w:val="single" w:sz="6" w:space="0" w:color="E6E6E6"/>
+              <w:left w:val="single" w:sz="6" w:space="0" w:color="E6E6E6"/>
+              <w:bottom w:val="single" w:sz="6" w:space="0" w:color="E6E6E6"/>
+              <w:right w:val="single" w:sz="6" w:space="0" w:color="E6E6E6"/>
+            </w:tcBorders>
+            <w:vAlign w:val="center"/>
+            <w:hideMark/>
+          </w:tcPr>
+          <w:p>
+            <w:pPr>
+              <w:spacing w:after="0" w:line="240" w:lineRule="auto"/>
+              <w:rPr>
+                <w:rFonts w:ascii="Times New Roman" w:eastAsia="Times New Roman" w:hAnsi="Times New Roman" w:cs="Times New Roman"/>
+                <w:kern w:val="0"/>
+                <w:sz w:val="24"/>
+                <w:szCs w:val="24"/>
+                <w:lang w:eastAsia="en-IN" w:bidi="ar-SA"/>
+                <w14:ligatures w14:val="none"/>
+              </w:rPr>
+            </w:pPr>
+            <w:r>
+              <w:rPr>
+                <w:rFonts w:ascii="Times New Roman" w:eastAsia="Times New Roman" w:hAnsi="Times New Roman" w:cs="Times New Roman"/>
+                <w:kern w:val="0"/>
+                <w:sz w:val="24"/>
+                <w:szCs w:val="24"/>
+                <w:lang w:eastAsia="en-IN" w:bidi="ar-SA"/>
+                <w14:ligatures w14:val="none"/>
+              </w:rPr>
+              <w:t xml:space="preserve">AdaBoost, </w:t>
+            </w:r>
+            <w:proofErr w:type="spellStart"/>
+            <w:r>
+              <w:rPr>
+                <w:rFonts w:ascii="Times New Roman" w:eastAsia="Times New Roman" w:hAnsi="Times New Roman" w:cs="Times New Roman"/>
+                <w:kern w:val="0"/>
+                <w:sz w:val="24"/>
+                <w:szCs w:val="24"/>
+                <w:lang w:eastAsia="en-IN" w:bidi="ar-SA"/>
+                <w14:ligatures w14:val="none"/>
+              </w:rPr>
+              <w:t>XGBoost</w:t>
+            </w:r>
+            <w:proofErr w:type="spellEnd"/>
+          </w:p>
+        </w:tc>
+      </w:tr>
+    </w:tbl>
+    <w:p>
+      <w:pPr>
+        <w:spacing w:after="0" w:line="300" w:lineRule="atLeast"/>
+        <w:rPr>
+          <w:rFonts w:ascii="Segoe UI" w:eastAsia="Times New Roman" w:hAnsi="Segoe UI" w:cs="Segoe UI"/>
+          <w:kern w:val="0"/>
+          <w:sz w:val="21"/>
+          <w:szCs w:val="21"/>
+          <w:lang w:eastAsia="en-IN" w:bidi="ar-SA"/>
+          <w14:ligatures w14:val="none"/>
+        </w:rPr>
+      </w:pPr>
+      <w:r>
+        <w:rPr>
+          <w:rFonts w:ascii="Segoe UI" w:eastAsia="Times New Roman" w:hAnsi="Segoe UI" w:cs="Segoe UI"/>
+          <w:kern w:val="0"/>
+          <w:sz w:val="21"/>
+          <w:szCs w:val="21"/>
+          <w:lang w:eastAsia="en-IN" w:bidi="ar-SA"/>
+          <w14:ligatures w14:val="none"/>
+        </w:rPr>
+        <w:pict w14:anchorId="2B42C5F6">
+          <v:rect id="_x0000_i1109" style="width:0;height:1.5pt" o:hralign="center" o:hrstd="t" o:hr="t" fillcolor="#a0a0a0" stroked="f"/>
+        </w:pict>
+      </w:r>
+    </w:p>
+    <w:p>
+      <w:pPr>
+        <w:spacing w:before="100" w:beforeAutospacing="1" w:after="100" w:afterAutospacing="1" w:line="300" w:lineRule="atLeast"/>
+        <w:outlineLvl w:val="0"/>
+        <w:rPr>
+          <w:rFonts w:ascii="Segoe UI" w:eastAsia="Times New Roman" w:hAnsi="Segoe UI" w:cs="Segoe UI"/>
+          <w:b/>
+          <w:bCs/>
+          <w:kern w:val="36"/>
+          <w:sz w:val="48"/>
+          <w:szCs w:val="48"/>
+          <w:lang w:eastAsia="en-IN" w:bidi="ar-SA"/>
+          <w14:ligatures w14:val="none"/>
+        </w:rPr>
+      </w:pPr>
+      <w:r>
+        <w:rPr>
+          <w:rFonts w:ascii="Segoe UI" w:eastAsia="Times New Roman" w:hAnsi="Segoe UI" w:cs="Segoe UI"/>
+          <w:b/>
+          <w:bCs/>
+          <w:kern w:val="36"/>
+          <w:sz w:val="48"/>
+          <w:szCs w:val="48"/>
+          <w:lang w:eastAsia="en-IN" w:bidi="ar-SA"/>
+          <w14:ligatures w14:val="none"/>
+        </w:rPr>
+        <w:t>Advantages of Bagging</w:t>
+      </w:r>
+    </w:p>
+    <w:p>
+      <w:pPr>
+        <w:spacing w:before="100" w:beforeAutospacing="1" w:after="100" w:afterAutospacing="1" w:line="300" w:lineRule="atLeast"/>
+        <w:rPr>
+          <w:rFonts w:ascii="Segoe UI" w:eastAsia="Times New Roman" w:hAnsi="Segoe UI" w:cs="Segoe UI"/>
+          <w:kern w:val="0"/>
+          <w:sz w:val="21"/>
+          <w:szCs w:val="21"/>
+          <w:lang w:eastAsia="en-IN" w:bidi="ar-SA"/>
+          <w14:ligatures w14:val="none"/>
+        </w:rPr>
+      </w:pPr>
+      <w:r>
+        <w:rPr>
+          <w:rFonts w:ascii="Segoe UI Emoji" w:eastAsia="Times New Roman" w:hAnsi="Segoe UI Emoji" w:cs="Segoe UI Emoji"/>
+          <w:kern w:val="0"/>
+          <w:sz w:val="21"/>
+          <w:szCs w:val="21"/>
+          <w:lang w:eastAsia="en-IN" w:bidi="ar-SA"/>
+          <w14:ligatures w14:val="none"/>
+        </w:rPr>
+        <w:t>✅</w:t>
+      </w:r>
+      <w:r>
+        <w:rPr>
+          <w:rFonts w:ascii="Segoe UI" w:eastAsia="Times New Roman" w:hAnsi="Segoe UI" w:cs="Segoe UI"/>
+          <w:kern w:val="0"/>
+          <w:sz w:val="21"/>
+          <w:szCs w:val="21"/>
+          <w:lang w:eastAsia="en-IN" w:bidi="ar-SA"/>
+          <w14:ligatures w14:val="none"/>
+        </w:rPr>
+        <w:t xml:space="preserve"> Reduces overfitting</w:t>
+      </w:r>
+    </w:p>
+    <w:p>
+      <w:pPr>
+        <w:spacing w:before="100" w:beforeAutospacing="1" w:after="100" w:afterAutospacing="1" w:line="300" w:lineRule="atLeast"/>
+        <w:rPr>
+          <w:rFonts w:ascii="Segoe UI" w:eastAsia="Times New Roman" w:hAnsi="Segoe UI" w:cs="Segoe UI"/>
+          <w:kern w:val="0"/>
+          <w:sz w:val="21"/>
+          <w:szCs w:val="21"/>
+          <w:lang w:eastAsia="en-IN" w:bidi="ar-SA"/>
+          <w14:ligatures w14:val="none"/>
+        </w:rPr>
+      </w:pPr>
+      <w:r>
+        <w:rPr>
+          <w:rFonts w:ascii="Segoe UI Emoji" w:eastAsia="Times New Roman" w:hAnsi="Segoe UI Emoji" w:cs="Segoe UI Emoji"/>
+          <w:kern w:val="0"/>
+          <w:sz w:val="21"/>
+          <w:szCs w:val="21"/>
+          <w:lang w:eastAsia="en-IN" w:bidi="ar-SA"/>
+          <w14:ligatures w14:val="none"/>
+        </w:rPr>
+        <w:t>✅</w:t>
+      </w:r>
+      <w:r>
+        <w:rPr>
+          <w:rFonts w:ascii="Segoe UI" w:eastAsia="Times New Roman" w:hAnsi="Segoe UI" w:cs="Segoe UI"/>
+          <w:kern w:val="0"/>
+          <w:sz w:val="21"/>
+          <w:szCs w:val="21"/>
+          <w:lang w:eastAsia="en-IN" w:bidi="ar-SA"/>
+          <w14:ligatures w14:val="none"/>
+        </w:rPr>
+        <w:t xml:space="preserve"> Reduces variance</w:t>
+      </w:r>
+    </w:p>
+    <w:p>
+      <w:pPr>
+        <w:spacing w:before="100" w:beforeAutospacing="1" w:after="100" w:afterAutospacing="1" w:line="300" w:lineRule="atLeast"/>
+        <w:rPr>
+          <w:rFonts w:ascii="Segoe UI" w:eastAsia="Times New Roman" w:hAnsi="Segoe UI" w:cs="Segoe UI"/>
+          <w:kern w:val="0"/>
+          <w:sz w:val="21"/>
+          <w:szCs w:val="21"/>
+          <w:lang w:eastAsia="en-IN" w:bidi="ar-SA"/>
+          <w14:ligatures w14:val="none"/>
+        </w:rPr>
+      </w:pPr>
+      <w:r>
+        <w:rPr>
+          <w:rFonts w:ascii="Segoe UI Emoji" w:eastAsia="Times New Roman" w:hAnsi="Segoe UI Emoji" w:cs="Segoe UI Emoji"/>
+          <w:kern w:val="0"/>
+          <w:sz w:val="21"/>
+          <w:szCs w:val="21"/>
+          <w:lang w:eastAsia="en-IN" w:bidi="ar-SA"/>
+          <w14:ligatures w14:val="none"/>
+        </w:rPr>
+        <w:t>✅</w:t>
+      </w:r>
+      <w:r>
+        <w:rPr>
+          <w:rFonts w:ascii="Segoe UI" w:eastAsia="Times New Roman" w:hAnsi="Segoe UI" w:cs="Segoe UI"/>
+          <w:kern w:val="0"/>
+          <w:sz w:val="21"/>
+          <w:szCs w:val="21"/>
+          <w:lang w:eastAsia="en-IN" w:bidi="ar-SA"/>
+          <w14:ligatures w14:val="none"/>
+        </w:rPr>
+        <w:t xml:space="preserve"> Improves accuracy</w:t>
+      </w:r>
+    </w:p>
+    <w:p>
+      <w:pPr>
+        <w:spacing w:before="100" w:beforeAutospacing="1" w:after="100" w:afterAutospacing="1" w:line="300" w:lineRule="atLeast"/>
+        <w:rPr>
+          <w:rFonts w:ascii="Segoe UI" w:eastAsia="Times New Roman" w:hAnsi="Segoe UI" w:cs="Segoe UI"/>
+          <w:kern w:val="0"/>
+          <w:sz w:val="21"/>
+          <w:szCs w:val="21"/>
+          <w:lang w:eastAsia="en-IN" w:bidi="ar-SA"/>
+          <w14:ligatures w14:val="none"/>
+        </w:rPr>
+      </w:pPr>
+      <w:r>
+        <w:rPr>
+          <w:rFonts w:ascii="Segoe UI Emoji" w:eastAsia="Times New Roman" w:hAnsi="Segoe UI Emoji" w:cs="Segoe UI Emoji"/>
+          <w:kern w:val="0"/>
+          <w:sz w:val="21"/>
+          <w:szCs w:val="21"/>
+          <w:lang w:eastAsia="en-IN" w:bidi="ar-SA"/>
+          <w14:ligatures w14:val="none"/>
+        </w:rPr>
+        <w:t>✅</w:t>
+      </w:r>
+      <w:r>
+        <w:rPr>
+          <w:rFonts w:ascii="Segoe UI" w:eastAsia="Times New Roman" w:hAnsi="Segoe UI" w:cs="Segoe UI"/>
+          <w:kern w:val="0"/>
+          <w:sz w:val="21"/>
+          <w:szCs w:val="21"/>
+          <w:lang w:eastAsia="en-IN" w:bidi="ar-SA"/>
+          <w14:ligatures w14:val="none"/>
+        </w:rPr>
+        <w:t xml:space="preserve"> Works well with Decision Trees</w:t>
+      </w:r>
+    </w:p>
+    <w:p>
+      <w:pPr>
+        <w:spacing w:before="100" w:beforeAutospacing="1" w:after="100" w:afterAutospacing="1" w:line="300" w:lineRule="atLeast"/>
+        <w:rPr>
+          <w:rFonts w:ascii="Segoe UI" w:eastAsia="Times New Roman" w:hAnsi="Segoe UI" w:cs="Segoe UI"/>
+          <w:kern w:val="0"/>
+          <w:sz w:val="21"/>
+          <w:szCs w:val="21"/>
+          <w:lang w:eastAsia="en-IN" w:bidi="ar-SA"/>
+          <w14:ligatures w14:val="none"/>
+        </w:rPr>
+      </w:pPr>
+      <w:r>
+        <w:rPr>
+          <w:rFonts w:ascii="Segoe UI Emoji" w:eastAsia="Times New Roman" w:hAnsi="Segoe UI Emoji" w:cs="Segoe UI Emoji"/>
+          <w:kern w:val="0"/>
+          <w:sz w:val="21"/>
+          <w:szCs w:val="21"/>
+          <w:lang w:eastAsia="en-IN" w:bidi="ar-SA"/>
+          <w14:ligatures w14:val="none"/>
+        </w:rPr>
+        <w:t>✅</w:t>
+      </w:r>
+      <w:r>
+        <w:rPr>
+          <w:rFonts w:ascii="Segoe UI" w:eastAsia="Times New Roman" w:hAnsi="Segoe UI" w:cs="Segoe UI"/>
+          <w:kern w:val="0"/>
+          <w:sz w:val="21"/>
+          <w:szCs w:val="21"/>
+          <w:lang w:eastAsia="en-IN" w:bidi="ar-SA"/>
+          <w14:ligatures w14:val="none"/>
+        </w:rPr>
+        <w:t xml:space="preserve"> Robust to noisy data</w:t>
+      </w:r>
+    </w:p>
+    <w:p>
+      <w:pPr>
+        <w:spacing w:after="0" w:line="300" w:lineRule="atLeast"/>
+        <w:rPr>
+          <w:rFonts w:ascii="Segoe UI" w:eastAsia="Times New Roman" w:hAnsi="Segoe UI" w:cs="Segoe UI"/>
+          <w:kern w:val="0"/>
+          <w:sz w:val="21"/>
+          <w:szCs w:val="21"/>
+          <w:lang w:eastAsia="en-IN" w:bidi="ar-SA"/>
+          <w14:ligatures w14:val="none"/>
+        </w:rPr>
+      </w:pPr>
+      <w:r>
+        <w:rPr>
+          <w:rFonts w:ascii="Segoe UI" w:eastAsia="Times New Roman" w:hAnsi="Segoe UI" w:cs="Segoe UI"/>
+          <w:kern w:val="0"/>
+          <w:sz w:val="21"/>
+          <w:szCs w:val="21"/>
+          <w:lang w:eastAsia="en-IN" w:bidi="ar-SA"/>
+          <w14:ligatures w14:val="none"/>
+        </w:rPr>
+        <w:lastRenderedPageBreak/>
+        <w:pict w14:anchorId="3BB135ED">
+          <v:rect id="_x0000_i1110" style="width:0;height:1.5pt" o:hralign="center" o:hrstd="t" o:hr="t" fillcolor="#a0a0a0" stroked="f"/>
+        </w:pict>
+      </w:r>
+    </w:p>
+    <w:p>
+      <w:pPr>
+        <w:spacing w:before="100" w:beforeAutospacing="1" w:after="100" w:afterAutospacing="1" w:line="300" w:lineRule="atLeast"/>
+        <w:outlineLvl w:val="0"/>
+        <w:rPr>
+          <w:rFonts w:ascii="Segoe UI" w:eastAsia="Times New Roman" w:hAnsi="Segoe UI" w:cs="Segoe UI"/>
+          <w:b/>
+          <w:bCs/>
+          <w:kern w:val="36"/>
+          <w:sz w:val="48"/>
+          <w:szCs w:val="48"/>
+          <w:lang w:eastAsia="en-IN" w:bidi="ar-SA"/>
+          <w14:ligatures w14:val="none"/>
+        </w:rPr>
+      </w:pPr>
+      <w:r>
+        <w:rPr>
+          <w:rFonts w:ascii="Segoe UI" w:eastAsia="Times New Roman" w:hAnsi="Segoe UI" w:cs="Segoe UI"/>
+          <w:b/>
+          <w:bCs/>
+          <w:kern w:val="36"/>
+          <w:sz w:val="48"/>
+          <w:szCs w:val="48"/>
+          <w:lang w:eastAsia="en-IN" w:bidi="ar-SA"/>
+          <w14:ligatures w14:val="none"/>
+        </w:rPr>
+        <w:t>Disadvantages of Bagging</w:t>
+      </w:r>
+    </w:p>
+    <w:p>
+      <w:pPr>
+        <w:spacing w:before="100" w:beforeAutospacing="1" w:after="100" w:afterAutospacing="1" w:line="300" w:lineRule="atLeast"/>
+        <w:rPr>
+          <w:rFonts w:ascii="Segoe UI" w:eastAsia="Times New Roman" w:hAnsi="Segoe UI" w:cs="Segoe UI"/>
+          <w:kern w:val="0"/>
+          <w:sz w:val="21"/>
+          <w:szCs w:val="21"/>
+          <w:lang w:eastAsia="en-IN" w:bidi="ar-SA"/>
+          <w14:ligatures w14:val="none"/>
+        </w:rPr>
+      </w:pPr>
+      <w:r>
+        <w:rPr>
+          <w:rFonts w:ascii="Segoe UI Emoji" w:eastAsia="Times New Roman" w:hAnsi="Segoe UI Emoji" w:cs="Segoe UI Emoji"/>
+          <w:kern w:val="0"/>
+          <w:sz w:val="21"/>
+          <w:szCs w:val="21"/>
+          <w:lang w:eastAsia="en-IN" w:bidi="ar-SA"/>
+          <w14:ligatures w14:val="none"/>
+        </w:rPr>
+        <w:t>❌</w:t>
+      </w:r>
+      <w:r>
+        <w:rPr>
+          <w:rFonts w:ascii="Segoe UI" w:eastAsia="Times New Roman" w:hAnsi="Segoe UI" w:cs="Segoe UI"/>
+          <w:kern w:val="0"/>
+          <w:sz w:val="21"/>
+          <w:szCs w:val="21"/>
+          <w:lang w:eastAsia="en-IN" w:bidi="ar-SA"/>
+          <w14:ligatures w14:val="none"/>
+        </w:rPr>
+        <w:t xml:space="preserve"> More memory required</w:t>
+      </w:r>
+    </w:p>
+    <w:p>
+      <w:pPr>
+        <w:spacing w:before="100" w:beforeAutospacing="1" w:after="100" w:afterAutospacing="1" w:line="300" w:lineRule="atLeast"/>
+        <w:rPr>
+          <w:rFonts w:ascii="Segoe UI" w:eastAsia="Times New Roman" w:hAnsi="Segoe UI" w:cs="Segoe UI"/>
+          <w:kern w:val="0"/>
+          <w:sz w:val="21"/>
+          <w:szCs w:val="21"/>
+          <w:lang w:eastAsia="en-IN" w:bidi="ar-SA"/>
+          <w14:ligatures w14:val="none"/>
+        </w:rPr>
+      </w:pPr>
+      <w:r>
+        <w:rPr>
+          <w:rFonts w:ascii="Segoe UI Emoji" w:eastAsia="Times New Roman" w:hAnsi="Segoe UI Emoji" w:cs="Segoe UI Emoji"/>
+          <w:kern w:val="0"/>
+          <w:sz w:val="21"/>
+          <w:szCs w:val="21"/>
+          <w:lang w:eastAsia="en-IN" w:bidi="ar-SA"/>
+          <w14:ligatures w14:val="none"/>
+        </w:rPr>
+        <w:t>❌</w:t>
+      </w:r>
+      <w:r>
+        <w:rPr>
+          <w:rFonts w:ascii="Segoe UI" w:eastAsia="Times New Roman" w:hAnsi="Segoe UI" w:cs="Segoe UI"/>
+          <w:kern w:val="0"/>
+          <w:sz w:val="21"/>
+          <w:szCs w:val="21"/>
+          <w:lang w:eastAsia="en-IN" w:bidi="ar-SA"/>
+          <w14:ligatures w14:val="none"/>
+        </w:rPr>
+        <w:t xml:space="preserve"> Slower training</w:t>
+      </w:r>
+    </w:p>
+    <w:p>
+      <w:pPr>
+        <w:spacing w:before="100" w:beforeAutospacing="1" w:after="100" w:afterAutospacing="1" w:line="300" w:lineRule="atLeast"/>
+        <w:rPr>
+          <w:rFonts w:ascii="Segoe UI" w:eastAsia="Times New Roman" w:hAnsi="Segoe UI" w:cs="Segoe UI"/>
+          <w:kern w:val="0"/>
+          <w:sz w:val="21"/>
+          <w:szCs w:val="21"/>
+          <w:lang w:eastAsia="en-IN" w:bidi="ar-SA"/>
+          <w14:ligatures w14:val="none"/>
+        </w:rPr>
+      </w:pPr>
+      <w:r>
+        <w:rPr>
+          <w:rFonts w:ascii="Segoe UI Emoji" w:eastAsia="Times New Roman" w:hAnsi="Segoe UI Emoji" w:cs="Segoe UI Emoji"/>
+          <w:kern w:val="0"/>
+          <w:sz w:val="21"/>
+          <w:szCs w:val="21"/>
+          <w:lang w:eastAsia="en-IN" w:bidi="ar-SA"/>
+          <w14:ligatures w14:val="none"/>
+        </w:rPr>
+        <w:t>❌</w:t>
+      </w:r>
+      <w:r>
+        <w:rPr>
+          <w:rFonts w:ascii="Segoe UI" w:eastAsia="Times New Roman" w:hAnsi="Segoe UI" w:cs="Segoe UI"/>
+          <w:kern w:val="0"/>
+          <w:sz w:val="21"/>
+          <w:szCs w:val="21"/>
+          <w:lang w:eastAsia="en-IN" w:bidi="ar-SA"/>
+          <w14:ligatures w14:val="none"/>
+        </w:rPr>
+        <w:t xml:space="preserve"> Less interpretable than a single model</w:t>
+      </w:r>
+    </w:p>
+    <w:p>
+      <w:pPr>
+        <w:spacing w:after="0" w:line="300" w:lineRule="atLeast"/>
+        <w:rPr>
+          <w:rFonts w:ascii="Segoe UI" w:eastAsia="Times New Roman" w:hAnsi="Segoe UI" w:cs="Segoe UI"/>
+          <w:kern w:val="0"/>
+          <w:sz w:val="21"/>
+          <w:szCs w:val="21"/>
+          <w:lang w:eastAsia="en-IN" w:bidi="ar-SA"/>
+          <w14:ligatures w14:val="none"/>
+        </w:rPr>
+      </w:pPr>
+      <w:r>
+        <w:rPr>
+          <w:rFonts w:ascii="Segoe UI" w:eastAsia="Times New Roman" w:hAnsi="Segoe UI" w:cs="Segoe UI"/>
+          <w:kern w:val="0"/>
+          <w:sz w:val="21"/>
+          <w:szCs w:val="21"/>
+          <w:lang w:eastAsia="en-IN" w:bidi="ar-SA"/>
+          <w14:ligatures w14:val="none"/>
+        </w:rPr>
+        <w:pict w14:anchorId="186E8A7C">
+          <v:rect id="_x0000_i1111" style="width:0;height:1.5pt" o:hralign="center" o:hrstd="t" o:hr="t" fillcolor="#a0a0a0" stroked="f"/>
+        </w:pict>
+      </w:r>
+    </w:p>
+    <w:p>
+      <w:pPr>
+        <w:spacing w:before="100" w:beforeAutospacing="1" w:after="100" w:afterAutospacing="1" w:line="300" w:lineRule="atLeast"/>
+        <w:outlineLvl w:val="0"/>
+        <w:rPr>
+          <w:rFonts w:ascii="Segoe UI" w:eastAsia="Times New Roman" w:hAnsi="Segoe UI" w:cs="Segoe UI"/>
+          <w:b/>
+          <w:bCs/>
+          <w:kern w:val="36"/>
+          <w:sz w:val="48"/>
+          <w:szCs w:val="48"/>
+          <w:lang w:eastAsia="en-IN" w:bidi="ar-SA"/>
+          <w14:ligatures w14:val="none"/>
+        </w:rPr>
+      </w:pPr>
+      <w:r>
+        <w:rPr>
+          <w:rFonts w:ascii="Segoe UI" w:eastAsia="Times New Roman" w:hAnsi="Segoe UI" w:cs="Segoe UI"/>
+          <w:b/>
+          <w:bCs/>
+          <w:kern w:val="36"/>
+          <w:sz w:val="48"/>
+          <w:szCs w:val="48"/>
+          <w:lang w:eastAsia="en-IN" w:bidi="ar-SA"/>
+          <w14:ligatures w14:val="none"/>
+        </w:rPr>
+        <w:t>Exam Definition</w:t>
+      </w:r>
+    </w:p>
+    <w:p>
+      <w:pPr>
+        <w:spacing w:before="100" w:beforeAutospacing="1" w:after="100" w:afterAutospacing="1" w:line="300" w:lineRule="atLeast"/>
+        <w:rPr>
+          <w:rFonts w:ascii="Segoe UI" w:eastAsia="Times New Roman" w:hAnsi="Segoe UI" w:cs="Segoe UI"/>
+          <w:kern w:val="0"/>
+          <w:sz w:val="21"/>
+          <w:szCs w:val="21"/>
+          <w:lang w:eastAsia="en-IN" w:bidi="ar-SA"/>
+          <w14:ligatures w14:val="none"/>
+        </w:rPr>
+      </w:pPr>
+      <w:r>
+        <w:rPr>
+          <w:rFonts w:ascii="Segoe UI" w:eastAsia="Times New Roman" w:hAnsi="Segoe UI" w:cs="Segoe UI"/>
+          <w:b/>
+          <w:bCs/>
+          <w:kern w:val="0"/>
+          <w:sz w:val="21"/>
+          <w:szCs w:val="21"/>
+          <w:lang w:eastAsia="en-IN" w:bidi="ar-SA"/>
+          <w14:ligatures w14:val="none"/>
+        </w:rPr>
+        <w:t>Bagging (Bootstrap Aggregating) is an ensemble learning technique in which multiple models are trained on different bootstrap samples of the training data and their predictions are combined using majority voting (classification) or averaging (regression) to improve accuracy and reduce overfitting.</w:t>
+      </w:r>
+    </w:p>
+    <w:p>
+      <w:pPr>
+        <w:pStyle w:val="Heading1"/>
+      </w:pPr>
+      <w:r>
+        <w:t>Naive Bayes</w:t>
+      </w:r>
+    </w:p>
+    <w:p>
+      <w:r>
+        <w:t xml:space="preserve"> is a machine learning classification algorithm that predicts the category of a data point using probability. It assumes that all features are independent of each other. Naive Bayes performs well in many real-world applications such as spam filtering, document categorization and sentiment analysis.</w:t>
       </w:r>
     </w:p>
     <w:p/>
@@ -21751,6 +23645,155 @@
     </w:lvl>
   </w:abstractNum>
   <w:abstractNum w:abstractNumId="20" w15:restartNumberingAfterBreak="0">
+    <w:nsid w:val="21FB40B0"/>
+    <w:multiLevelType w:val="multilevel"/>
+    <w:tmpl w:val="B6B8535A"/>
+    <w:lvl w:ilvl="0">
+      <w:start w:val="1"/>
+      <w:numFmt w:val="bullet"/>
+      <w:lvlText w:val=""/>
+      <w:lvlJc w:val="left"/>
+      <w:pPr>
+        <w:tabs>
+          <w:tab w:val="num" w:pos="720"/>
+        </w:tabs>
+        <w:ind w:left="720" w:hanging="360"/>
+      </w:pPr>
+      <w:rPr>
+        <w:rFonts w:ascii="Symbol" w:hAnsi="Symbol" w:hint="default"/>
+        <w:sz w:val="20"/>
+      </w:rPr>
+    </w:lvl>
+    <w:lvl w:ilvl="1" w:tentative="1">
+      <w:start w:val="1"/>
+      <w:numFmt w:val="bullet"/>
+      <w:lvlText w:val="o"/>
+      <w:lvlJc w:val="left"/>
+      <w:pPr>
+        <w:tabs>
+          <w:tab w:val="num" w:pos="1440"/>
+        </w:tabs>
+        <w:ind w:left="1440" w:hanging="360"/>
+      </w:pPr>
+      <w:rPr>
+        <w:rFonts w:ascii="Courier New" w:hAnsi="Courier New" w:hint="default"/>
+        <w:sz w:val="20"/>
+      </w:rPr>
+    </w:lvl>
+    <w:lvl w:ilvl="2" w:tentative="1">
+      <w:start w:val="1"/>
+      <w:numFmt w:val="bullet"/>
+      <w:lvlText w:val=""/>
+      <w:lvlJc w:val="left"/>
+      <w:pPr>
+        <w:tabs>
+          <w:tab w:val="num" w:pos="2160"/>
+        </w:tabs>
+        <w:ind w:left="2160" w:hanging="360"/>
+      </w:pPr>
+      <w:rPr>
+        <w:rFonts w:ascii="Wingdings" w:hAnsi="Wingdings" w:hint="default"/>
+        <w:sz w:val="20"/>
+      </w:rPr>
+    </w:lvl>
+    <w:lvl w:ilvl="3" w:tentative="1">
+      <w:start w:val="1"/>
+      <w:numFmt w:val="bullet"/>
+      <w:lvlText w:val=""/>
+      <w:lvlJc w:val="left"/>
+      <w:pPr>
+        <w:tabs>
+          <w:tab w:val="num" w:pos="2880"/>
+        </w:tabs>
+        <w:ind w:left="2880" w:hanging="360"/>
+      </w:pPr>
+      <w:rPr>
+        <w:rFonts w:ascii="Wingdings" w:hAnsi="Wingdings" w:hint="default"/>
+        <w:sz w:val="20"/>
+      </w:rPr>
+    </w:lvl>
+    <w:lvl w:ilvl="4" w:tentative="1">
+      <w:start w:val="1"/>
+      <w:numFmt w:val="bullet"/>
+      <w:lvlText w:val=""/>
+      <w:lvlJc w:val="left"/>
+      <w:pPr>
+        <w:tabs>
+          <w:tab w:val="num" w:pos="3600"/>
+        </w:tabs>
+        <w:ind w:left="3600" w:hanging="360"/>
+      </w:pPr>
+      <w:rPr>
+        <w:rFonts w:ascii="Wingdings" w:hAnsi="Wingdings" w:hint="default"/>
+        <w:sz w:val="20"/>
+      </w:rPr>
+    </w:lvl>
+    <w:lvl w:ilvl="5" w:tentative="1">
+      <w:start w:val="1"/>
+      <w:numFmt w:val="bullet"/>
+      <w:lvlText w:val=""/>
+      <w:lvlJc w:val="left"/>
+      <w:pPr>
+        <w:tabs>
+          <w:tab w:val="num" w:pos="4320"/>
+        </w:tabs>
+        <w:ind w:left="4320" w:hanging="360"/>
+      </w:pPr>
+      <w:rPr>
+        <w:rFonts w:ascii="Wingdings" w:hAnsi="Wingdings" w:hint="default"/>
+        <w:sz w:val="20"/>
+      </w:rPr>
+    </w:lvl>
+    <w:lvl w:ilvl="6" w:tentative="1">
+      <w:start w:val="1"/>
+      <w:numFmt w:val="bullet"/>
+      <w:lvlText w:val=""/>
+      <w:lvlJc w:val="left"/>
+      <w:pPr>
+        <w:tabs>
+          <w:tab w:val="num" w:pos="5040"/>
+        </w:tabs>
+        <w:ind w:left="5040" w:hanging="360"/>
+      </w:pPr>
+      <w:rPr>
+        <w:rFonts w:ascii="Wingdings" w:hAnsi="Wingdings" w:hint="default"/>
+        <w:sz w:val="20"/>
+      </w:rPr>
+    </w:lvl>
+    <w:lvl w:ilvl="7" w:tentative="1">
+      <w:start w:val="1"/>
+      <w:numFmt w:val="bullet"/>
+      <w:lvlText w:val=""/>
+      <w:lvlJc w:val="left"/>
+      <w:pPr>
+        <w:tabs>
+          <w:tab w:val="num" w:pos="5760"/>
+        </w:tabs>
+        <w:ind w:left="5760" w:hanging="360"/>
+      </w:pPr>
+      <w:rPr>
+        <w:rFonts w:ascii="Wingdings" w:hAnsi="Wingdings" w:hint="default"/>
+        <w:sz w:val="20"/>
+      </w:rPr>
+    </w:lvl>
+    <w:lvl w:ilvl="8" w:tentative="1">
+      <w:start w:val="1"/>
+      <w:numFmt w:val="bullet"/>
+      <w:lvlText w:val=""/>
+      <w:lvlJc w:val="left"/>
+      <w:pPr>
+        <w:tabs>
+          <w:tab w:val="num" w:pos="6480"/>
+        </w:tabs>
+        <w:ind w:left="6480" w:hanging="360"/>
+      </w:pPr>
+      <w:rPr>
+        <w:rFonts w:ascii="Wingdings" w:hAnsi="Wingdings" w:hint="default"/>
+        <w:sz w:val="20"/>
+      </w:rPr>
+    </w:lvl>
+  </w:abstractNum>
+  <w:abstractNum w:abstractNumId="21" w15:restartNumberingAfterBreak="0">
     <w:nsid w:val="25072852"/>
     <w:multiLevelType w:val="multilevel"/>
     <w:tmpl w:val="FE28CBF4"/>
@@ -21899,7 +23942,7 @@
       </w:rPr>
     </w:lvl>
   </w:abstractNum>
-  <w:abstractNum w:abstractNumId="21" w15:restartNumberingAfterBreak="0">
+  <w:abstractNum w:abstractNumId="22" w15:restartNumberingAfterBreak="0">
     <w:nsid w:val="29AA08FE"/>
     <w:multiLevelType w:val="multilevel"/>
     <w:tmpl w:val="56406930"/>
@@ -22048,7 +24091,7 @@
       </w:rPr>
     </w:lvl>
   </w:abstractNum>
-  <w:abstractNum w:abstractNumId="22" w15:restartNumberingAfterBreak="0">
+  <w:abstractNum w:abstractNumId="23" w15:restartNumberingAfterBreak="0">
     <w:nsid w:val="2AA24881"/>
     <w:multiLevelType w:val="multilevel"/>
     <w:tmpl w:val="9B2C7CBE"/>
@@ -22197,7 +24240,7 @@
       </w:rPr>
     </w:lvl>
   </w:abstractNum>
-  <w:abstractNum w:abstractNumId="23" w15:restartNumberingAfterBreak="0">
+  <w:abstractNum w:abstractNumId="24" w15:restartNumberingAfterBreak="0">
     <w:nsid w:val="2D137E2B"/>
     <w:multiLevelType w:val="multilevel"/>
     <w:tmpl w:val="3BA46BD6"/>
@@ -22346,7 +24389,7 @@
       </w:rPr>
     </w:lvl>
   </w:abstractNum>
-  <w:abstractNum w:abstractNumId="24" w15:restartNumberingAfterBreak="0">
+  <w:abstractNum w:abstractNumId="25" w15:restartNumberingAfterBreak="0">
     <w:nsid w:val="2D6C4BA6"/>
     <w:multiLevelType w:val="multilevel"/>
     <w:tmpl w:val="E828F402"/>
@@ -22495,7 +24538,7 @@
       </w:rPr>
     </w:lvl>
   </w:abstractNum>
-  <w:abstractNum w:abstractNumId="25" w15:restartNumberingAfterBreak="0">
+  <w:abstractNum w:abstractNumId="26" w15:restartNumberingAfterBreak="0">
     <w:nsid w:val="33157B98"/>
     <w:multiLevelType w:val="multilevel"/>
     <w:tmpl w:val="7CB24D46"/>
@@ -22644,7 +24687,7 @@
       </w:rPr>
     </w:lvl>
   </w:abstractNum>
-  <w:abstractNum w:abstractNumId="26" w15:restartNumberingAfterBreak="0">
+  <w:abstractNum w:abstractNumId="27" w15:restartNumberingAfterBreak="0">
     <w:nsid w:val="34236E93"/>
     <w:multiLevelType w:val="multilevel"/>
     <w:tmpl w:val="73DAE54E"/>
@@ -22793,7 +24836,7 @@
       </w:rPr>
     </w:lvl>
   </w:abstractNum>
-  <w:abstractNum w:abstractNumId="27" w15:restartNumberingAfterBreak="0">
+  <w:abstractNum w:abstractNumId="28" w15:restartNumberingAfterBreak="0">
     <w:nsid w:val="38497EFF"/>
     <w:multiLevelType w:val="multilevel"/>
     <w:tmpl w:val="BA5273A0"/>
@@ -22942,7 +24985,7 @@
       </w:rPr>
     </w:lvl>
   </w:abstractNum>
-  <w:abstractNum w:abstractNumId="28" w15:restartNumberingAfterBreak="0">
+  <w:abstractNum w:abstractNumId="29" w15:restartNumberingAfterBreak="0">
     <w:nsid w:val="39B51A90"/>
     <w:multiLevelType w:val="multilevel"/>
     <w:tmpl w:val="581697D4"/>
@@ -23091,7 +25134,7 @@
       </w:rPr>
     </w:lvl>
   </w:abstractNum>
-  <w:abstractNum w:abstractNumId="29" w15:restartNumberingAfterBreak="0">
+  <w:abstractNum w:abstractNumId="30" w15:restartNumberingAfterBreak="0">
     <w:nsid w:val="3B154485"/>
     <w:multiLevelType w:val="multilevel"/>
     <w:tmpl w:val="BA6EAD28"/>
@@ -23240,7 +25283,7 @@
       </w:rPr>
     </w:lvl>
   </w:abstractNum>
-  <w:abstractNum w:abstractNumId="30" w15:restartNumberingAfterBreak="0">
+  <w:abstractNum w:abstractNumId="31" w15:restartNumberingAfterBreak="0">
     <w:nsid w:val="3E087B1A"/>
     <w:multiLevelType w:val="multilevel"/>
     <w:tmpl w:val="AA18DB8E"/>
@@ -23389,7 +25432,7 @@
       </w:rPr>
     </w:lvl>
   </w:abstractNum>
-  <w:abstractNum w:abstractNumId="31" w15:restartNumberingAfterBreak="0">
+  <w:abstractNum w:abstractNumId="32" w15:restartNumberingAfterBreak="0">
     <w:nsid w:val="3FE322DB"/>
     <w:multiLevelType w:val="multilevel"/>
     <w:tmpl w:val="DF08AFAE"/>
@@ -23538,7 +25581,7 @@
       </w:rPr>
     </w:lvl>
   </w:abstractNum>
-  <w:abstractNum w:abstractNumId="32" w15:restartNumberingAfterBreak="0">
+  <w:abstractNum w:abstractNumId="33" w15:restartNumberingAfterBreak="0">
     <w:nsid w:val="401E7270"/>
     <w:multiLevelType w:val="multilevel"/>
     <w:tmpl w:val="FCDC4C5A"/>
@@ -23687,7 +25730,7 @@
       </w:rPr>
     </w:lvl>
   </w:abstractNum>
-  <w:abstractNum w:abstractNumId="33" w15:restartNumberingAfterBreak="0">
+  <w:abstractNum w:abstractNumId="34" w15:restartNumberingAfterBreak="0">
     <w:nsid w:val="42B00D67"/>
     <w:multiLevelType w:val="multilevel"/>
     <w:tmpl w:val="CFD6C7B8"/>
@@ -23836,7 +25879,7 @@
       </w:rPr>
     </w:lvl>
   </w:abstractNum>
-  <w:abstractNum w:abstractNumId="34" w15:restartNumberingAfterBreak="0">
+  <w:abstractNum w:abstractNumId="35" w15:restartNumberingAfterBreak="0">
     <w:nsid w:val="43EB4240"/>
     <w:multiLevelType w:val="multilevel"/>
     <w:tmpl w:val="A0626B1A"/>
@@ -23985,7 +26028,7 @@
       </w:rPr>
     </w:lvl>
   </w:abstractNum>
-  <w:abstractNum w:abstractNumId="35" w15:restartNumberingAfterBreak="0">
+  <w:abstractNum w:abstractNumId="36" w15:restartNumberingAfterBreak="0">
     <w:nsid w:val="46DE6EE1"/>
     <w:multiLevelType w:val="multilevel"/>
     <w:tmpl w:val="19E0EB3E"/>
@@ -24134,7 +26177,7 @@
       </w:rPr>
     </w:lvl>
   </w:abstractNum>
-  <w:abstractNum w:abstractNumId="36" w15:restartNumberingAfterBreak="0">
+  <w:abstractNum w:abstractNumId="37" w15:restartNumberingAfterBreak="0">
     <w:nsid w:val="49EE67E8"/>
     <w:multiLevelType w:val="multilevel"/>
     <w:tmpl w:val="19287AEE"/>
@@ -24283,7 +26326,7 @@
       </w:rPr>
     </w:lvl>
   </w:abstractNum>
-  <w:abstractNum w:abstractNumId="37" w15:restartNumberingAfterBreak="0">
+  <w:abstractNum w:abstractNumId="38" w15:restartNumberingAfterBreak="0">
     <w:nsid w:val="4AF90842"/>
     <w:multiLevelType w:val="multilevel"/>
     <w:tmpl w:val="1848DC94"/>
@@ -24432,7 +26475,7 @@
       </w:rPr>
     </w:lvl>
   </w:abstractNum>
-  <w:abstractNum w:abstractNumId="38" w15:restartNumberingAfterBreak="0">
+  <w:abstractNum w:abstractNumId="39" w15:restartNumberingAfterBreak="0">
     <w:nsid w:val="4D1030CA"/>
     <w:multiLevelType w:val="multilevel"/>
     <w:tmpl w:val="C64CEB7C"/>
@@ -24581,7 +26624,7 @@
       </w:rPr>
     </w:lvl>
   </w:abstractNum>
-  <w:abstractNum w:abstractNumId="39" w15:restartNumberingAfterBreak="0">
+  <w:abstractNum w:abstractNumId="40" w15:restartNumberingAfterBreak="0">
     <w:nsid w:val="4DD06017"/>
     <w:multiLevelType w:val="multilevel"/>
     <w:tmpl w:val="20582C52"/>
@@ -24730,7 +26773,7 @@
       </w:rPr>
     </w:lvl>
   </w:abstractNum>
-  <w:abstractNum w:abstractNumId="40" w15:restartNumberingAfterBreak="0">
+  <w:abstractNum w:abstractNumId="41" w15:restartNumberingAfterBreak="0">
     <w:nsid w:val="4EF66A51"/>
     <w:multiLevelType w:val="multilevel"/>
     <w:tmpl w:val="EB9C7E52"/>
@@ -24879,7 +26922,7 @@
       </w:rPr>
     </w:lvl>
   </w:abstractNum>
-  <w:abstractNum w:abstractNumId="41" w15:restartNumberingAfterBreak="0">
+  <w:abstractNum w:abstractNumId="42" w15:restartNumberingAfterBreak="0">
     <w:nsid w:val="560E2C6B"/>
     <w:multiLevelType w:val="multilevel"/>
     <w:tmpl w:val="7B1C71C2"/>
@@ -25028,7 +27071,7 @@
       </w:rPr>
     </w:lvl>
   </w:abstractNum>
-  <w:abstractNum w:abstractNumId="42" w15:restartNumberingAfterBreak="0">
+  <w:abstractNum w:abstractNumId="43" w15:restartNumberingAfterBreak="0">
     <w:nsid w:val="58AE4C0F"/>
     <w:multiLevelType w:val="multilevel"/>
     <w:tmpl w:val="34561C36"/>
@@ -25177,7 +27220,7 @@
       </w:rPr>
     </w:lvl>
   </w:abstractNum>
-  <w:abstractNum w:abstractNumId="43" w15:restartNumberingAfterBreak="0">
+  <w:abstractNum w:abstractNumId="44" w15:restartNumberingAfterBreak="0">
     <w:nsid w:val="5B504AE1"/>
     <w:multiLevelType w:val="multilevel"/>
     <w:tmpl w:val="A2120610"/>
@@ -25326,7 +27369,7 @@
       </w:rPr>
     </w:lvl>
   </w:abstractNum>
-  <w:abstractNum w:abstractNumId="44" w15:restartNumberingAfterBreak="0">
+  <w:abstractNum w:abstractNumId="45" w15:restartNumberingAfterBreak="0">
     <w:nsid w:val="5E6C1297"/>
     <w:multiLevelType w:val="multilevel"/>
     <w:tmpl w:val="D402072A"/>
@@ -25475,7 +27518,7 @@
       </w:rPr>
     </w:lvl>
   </w:abstractNum>
-  <w:abstractNum w:abstractNumId="45" w15:restartNumberingAfterBreak="0">
+  <w:abstractNum w:abstractNumId="46" w15:restartNumberingAfterBreak="0">
     <w:nsid w:val="5EBF0E2A"/>
     <w:multiLevelType w:val="multilevel"/>
     <w:tmpl w:val="2CF630C6"/>
@@ -25624,7 +27667,7 @@
       </w:rPr>
     </w:lvl>
   </w:abstractNum>
-  <w:abstractNum w:abstractNumId="46" w15:restartNumberingAfterBreak="0">
+  <w:abstractNum w:abstractNumId="47" w15:restartNumberingAfterBreak="0">
     <w:nsid w:val="60E75265"/>
     <w:multiLevelType w:val="multilevel"/>
     <w:tmpl w:val="623CEC22"/>
@@ -25773,7 +27816,7 @@
       </w:rPr>
     </w:lvl>
   </w:abstractNum>
-  <w:abstractNum w:abstractNumId="47" w15:restartNumberingAfterBreak="0">
+  <w:abstractNum w:abstractNumId="48" w15:restartNumberingAfterBreak="0">
     <w:nsid w:val="62A23759"/>
     <w:multiLevelType w:val="multilevel"/>
     <w:tmpl w:val="1FFC7180"/>
@@ -25922,7 +27965,7 @@
       </w:rPr>
     </w:lvl>
   </w:abstractNum>
-  <w:abstractNum w:abstractNumId="48" w15:restartNumberingAfterBreak="0">
+  <w:abstractNum w:abstractNumId="49" w15:restartNumberingAfterBreak="0">
     <w:nsid w:val="636270C1"/>
     <w:multiLevelType w:val="multilevel"/>
     <w:tmpl w:val="DD1C3CD4"/>
@@ -26071,7 +28114,7 @@
       </w:rPr>
     </w:lvl>
   </w:abstractNum>
-  <w:abstractNum w:abstractNumId="49" w15:restartNumberingAfterBreak="0">
+  <w:abstractNum w:abstractNumId="50" w15:restartNumberingAfterBreak="0">
     <w:nsid w:val="6E2015F0"/>
     <w:multiLevelType w:val="multilevel"/>
     <w:tmpl w:val="86B8D88E"/>
@@ -26220,7 +28263,7 @@
       </w:rPr>
     </w:lvl>
   </w:abstractNum>
-  <w:abstractNum w:abstractNumId="50" w15:restartNumberingAfterBreak="0">
+  <w:abstractNum w:abstractNumId="51" w15:restartNumberingAfterBreak="0">
     <w:nsid w:val="6F7C3DF6"/>
     <w:multiLevelType w:val="multilevel"/>
     <w:tmpl w:val="78E8D560"/>
@@ -26369,7 +28412,156 @@
       </w:rPr>
     </w:lvl>
   </w:abstractNum>
-  <w:abstractNum w:abstractNumId="51" w15:restartNumberingAfterBreak="0">
+  <w:abstractNum w:abstractNumId="52" w15:restartNumberingAfterBreak="0">
+    <w:nsid w:val="6FAF610F"/>
+    <w:multiLevelType w:val="multilevel"/>
+    <w:tmpl w:val="6D4ECE46"/>
+    <w:lvl w:ilvl="0">
+      <w:start w:val="1"/>
+      <w:numFmt w:val="bullet"/>
+      <w:lvlText w:val=""/>
+      <w:lvlJc w:val="left"/>
+      <w:pPr>
+        <w:tabs>
+          <w:tab w:val="num" w:pos="720"/>
+        </w:tabs>
+        <w:ind w:left="720" w:hanging="360"/>
+      </w:pPr>
+      <w:rPr>
+        <w:rFonts w:ascii="Symbol" w:hAnsi="Symbol" w:hint="default"/>
+        <w:sz w:val="20"/>
+      </w:rPr>
+    </w:lvl>
+    <w:lvl w:ilvl="1" w:tentative="1">
+      <w:start w:val="1"/>
+      <w:numFmt w:val="bullet"/>
+      <w:lvlText w:val="o"/>
+      <w:lvlJc w:val="left"/>
+      <w:pPr>
+        <w:tabs>
+          <w:tab w:val="num" w:pos="1440"/>
+        </w:tabs>
+        <w:ind w:left="1440" w:hanging="360"/>
+      </w:pPr>
+      <w:rPr>
+        <w:rFonts w:ascii="Courier New" w:hAnsi="Courier New" w:hint="default"/>
+        <w:sz w:val="20"/>
+      </w:rPr>
+    </w:lvl>
+    <w:lvl w:ilvl="2" w:tentative="1">
+      <w:start w:val="1"/>
+      <w:numFmt w:val="bullet"/>
+      <w:lvlText w:val=""/>
+      <w:lvlJc w:val="left"/>
+      <w:pPr>
+        <w:tabs>
+          <w:tab w:val="num" w:pos="2160"/>
+        </w:tabs>
+        <w:ind w:left="2160" w:hanging="360"/>
+      </w:pPr>
+      <w:rPr>
+        <w:rFonts w:ascii="Wingdings" w:hAnsi="Wingdings" w:hint="default"/>
+        <w:sz w:val="20"/>
+      </w:rPr>
+    </w:lvl>
+    <w:lvl w:ilvl="3" w:tentative="1">
+      <w:start w:val="1"/>
+      <w:numFmt w:val="bullet"/>
+      <w:lvlText w:val=""/>
+      <w:lvlJc w:val="left"/>
+      <w:pPr>
+        <w:tabs>
+          <w:tab w:val="num" w:pos="2880"/>
+        </w:tabs>
+        <w:ind w:left="2880" w:hanging="360"/>
+      </w:pPr>
+      <w:rPr>
+        <w:rFonts w:ascii="Wingdings" w:hAnsi="Wingdings" w:hint="default"/>
+        <w:sz w:val="20"/>
+      </w:rPr>
+    </w:lvl>
+    <w:lvl w:ilvl="4" w:tentative="1">
+      <w:start w:val="1"/>
+      <w:numFmt w:val="bullet"/>
+      <w:lvlText w:val=""/>
+      <w:lvlJc w:val="left"/>
+      <w:pPr>
+        <w:tabs>
+          <w:tab w:val="num" w:pos="3600"/>
+        </w:tabs>
+        <w:ind w:left="3600" w:hanging="360"/>
+      </w:pPr>
+      <w:rPr>
+        <w:rFonts w:ascii="Wingdings" w:hAnsi="Wingdings" w:hint="default"/>
+        <w:sz w:val="20"/>
+      </w:rPr>
+    </w:lvl>
+    <w:lvl w:ilvl="5" w:tentative="1">
+      <w:start w:val="1"/>
+      <w:numFmt w:val="bullet"/>
+      <w:lvlText w:val=""/>
+      <w:lvlJc w:val="left"/>
+      <w:pPr>
+        <w:tabs>
+          <w:tab w:val="num" w:pos="4320"/>
+        </w:tabs>
+        <w:ind w:left="4320" w:hanging="360"/>
+      </w:pPr>
+      <w:rPr>
+        <w:rFonts w:ascii="Wingdings" w:hAnsi="Wingdings" w:hint="default"/>
+        <w:sz w:val="20"/>
+      </w:rPr>
+    </w:lvl>
+    <w:lvl w:ilvl="6" w:tentative="1">
+      <w:start w:val="1"/>
+      <w:numFmt w:val="bullet"/>
+      <w:lvlText w:val=""/>
+      <w:lvlJc w:val="left"/>
+      <w:pPr>
+        <w:tabs>
+          <w:tab w:val="num" w:pos="5040"/>
+        </w:tabs>
+        <w:ind w:left="5040" w:hanging="360"/>
+      </w:pPr>
+      <w:rPr>
+        <w:rFonts w:ascii="Wingdings" w:hAnsi="Wingdings" w:hint="default"/>
+        <w:sz w:val="20"/>
+      </w:rPr>
+    </w:lvl>
+    <w:lvl w:ilvl="7" w:tentative="1">
+      <w:start w:val="1"/>
+      <w:numFmt w:val="bullet"/>
+      <w:lvlText w:val=""/>
+      <w:lvlJc w:val="left"/>
+      <w:pPr>
+        <w:tabs>
+          <w:tab w:val="num" w:pos="5760"/>
+        </w:tabs>
+        <w:ind w:left="5760" w:hanging="360"/>
+      </w:pPr>
+      <w:rPr>
+        <w:rFonts w:ascii="Wingdings" w:hAnsi="Wingdings" w:hint="default"/>
+        <w:sz w:val="20"/>
+      </w:rPr>
+    </w:lvl>
+    <w:lvl w:ilvl="8" w:tentative="1">
+      <w:start w:val="1"/>
+      <w:numFmt w:val="bullet"/>
+      <w:lvlText w:val=""/>
+      <w:lvlJc w:val="left"/>
+      <w:pPr>
+        <w:tabs>
+          <w:tab w:val="num" w:pos="6480"/>
+        </w:tabs>
+        <w:ind w:left="6480" w:hanging="360"/>
+      </w:pPr>
+      <w:rPr>
+        <w:rFonts w:ascii="Wingdings" w:hAnsi="Wingdings" w:hint="default"/>
+        <w:sz w:val="20"/>
+      </w:rPr>
+    </w:lvl>
+  </w:abstractNum>
+  <w:abstractNum w:abstractNumId="53" w15:restartNumberingAfterBreak="0">
     <w:nsid w:val="6FB00996"/>
     <w:multiLevelType w:val="multilevel"/>
     <w:tmpl w:val="D91A4A14"/>
@@ -26518,7 +28710,7 @@
       </w:rPr>
     </w:lvl>
   </w:abstractNum>
-  <w:abstractNum w:abstractNumId="52" w15:restartNumberingAfterBreak="0">
+  <w:abstractNum w:abstractNumId="54" w15:restartNumberingAfterBreak="0">
     <w:nsid w:val="72B6068A"/>
     <w:multiLevelType w:val="multilevel"/>
     <w:tmpl w:val="2A241F96"/>
@@ -26667,7 +28859,7 @@
       </w:rPr>
     </w:lvl>
   </w:abstractNum>
-  <w:abstractNum w:abstractNumId="53" w15:restartNumberingAfterBreak="0">
+  <w:abstractNum w:abstractNumId="55" w15:restartNumberingAfterBreak="0">
     <w:nsid w:val="750E6343"/>
     <w:multiLevelType w:val="multilevel"/>
     <w:tmpl w:val="761447A6"/>
@@ -26816,7 +29008,7 @@
       </w:rPr>
     </w:lvl>
   </w:abstractNum>
-  <w:abstractNum w:abstractNumId="54" w15:restartNumberingAfterBreak="0">
+  <w:abstractNum w:abstractNumId="56" w15:restartNumberingAfterBreak="0">
     <w:nsid w:val="7E9C7442"/>
     <w:multiLevelType w:val="multilevel"/>
     <w:tmpl w:val="D590B62A"/>
@@ -26965,7 +29157,7 @@
       </w:rPr>
     </w:lvl>
   </w:abstractNum>
-  <w:abstractNum w:abstractNumId="55" w15:restartNumberingAfterBreak="0">
+  <w:abstractNum w:abstractNumId="57" w15:restartNumberingAfterBreak="0">
     <w:nsid w:val="7F025237"/>
     <w:multiLevelType w:val="multilevel"/>
     <w:tmpl w:val="BED6C262"/>
@@ -27114,7 +29306,7 @@
       </w:rPr>
     </w:lvl>
   </w:abstractNum>
-  <w:abstractNum w:abstractNumId="56" w15:restartNumberingAfterBreak="0">
+  <w:abstractNum w:abstractNumId="58" w15:restartNumberingAfterBreak="0">
     <w:nsid w:val="7FBA5700"/>
     <w:multiLevelType w:val="multilevel"/>
     <w:tmpl w:val="D234D4CC"/>
@@ -27264,25 +29456,25 @@
     </w:lvl>
   </w:abstractNum>
   <w:num w:numId="1" w16cid:durableId="302196978">
-    <w:abstractNumId w:val="51"/>
+    <w:abstractNumId w:val="53"/>
     <w:lvlOverride w:ilvl="0">
       <w:startOverride w:val="1"/>
     </w:lvlOverride>
   </w:num>
   <w:num w:numId="2" w16cid:durableId="2091001298">
-    <w:abstractNumId w:val="51"/>
+    <w:abstractNumId w:val="53"/>
     <w:lvlOverride w:ilvl="0">
       <w:startOverride w:val="2"/>
     </w:lvlOverride>
   </w:num>
   <w:num w:numId="3" w16cid:durableId="281227696">
-    <w:abstractNumId w:val="51"/>
+    <w:abstractNumId w:val="53"/>
     <w:lvlOverride w:ilvl="0">
       <w:startOverride w:val="3"/>
     </w:lvlOverride>
   </w:num>
   <w:num w:numId="4" w16cid:durableId="1090469624">
-    <w:abstractNumId w:val="51"/>
+    <w:abstractNumId w:val="53"/>
     <w:lvlOverride w:ilvl="0">
       <w:startOverride w:val="4"/>
     </w:lvlOverride>
@@ -27330,115 +29522,115 @@
     </w:lvlOverride>
   </w:num>
   <w:num w:numId="12" w16cid:durableId="71631199">
-    <w:abstractNumId w:val="29"/>
+    <w:abstractNumId w:val="30"/>
     <w:lvlOverride w:ilvl="0">
       <w:startOverride w:val="1"/>
     </w:lvlOverride>
   </w:num>
   <w:num w:numId="13" w16cid:durableId="39985783">
-    <w:abstractNumId w:val="29"/>
+    <w:abstractNumId w:val="30"/>
     <w:lvlOverride w:ilvl="0">
       <w:startOverride w:val="2"/>
     </w:lvlOverride>
   </w:num>
   <w:num w:numId="14" w16cid:durableId="969630880">
-    <w:abstractNumId w:val="29"/>
+    <w:abstractNumId w:val="30"/>
     <w:lvlOverride w:ilvl="0">
       <w:startOverride w:val="3"/>
     </w:lvlOverride>
   </w:num>
   <w:num w:numId="15" w16cid:durableId="136191896">
-    <w:abstractNumId w:val="29"/>
+    <w:abstractNumId w:val="30"/>
     <w:lvlOverride w:ilvl="0">
       <w:startOverride w:val="4"/>
     </w:lvlOverride>
   </w:num>
   <w:num w:numId="16" w16cid:durableId="371729190">
-    <w:abstractNumId w:val="56"/>
+    <w:abstractNumId w:val="58"/>
     <w:lvlOverride w:ilvl="0">
       <w:startOverride w:val="1"/>
     </w:lvlOverride>
   </w:num>
   <w:num w:numId="17" w16cid:durableId="847715775">
-    <w:abstractNumId w:val="56"/>
+    <w:abstractNumId w:val="58"/>
     <w:lvlOverride w:ilvl="0">
       <w:startOverride w:val="2"/>
     </w:lvlOverride>
   </w:num>
   <w:num w:numId="18" w16cid:durableId="1304232547">
-    <w:abstractNumId w:val="56"/>
+    <w:abstractNumId w:val="58"/>
     <w:lvlOverride w:ilvl="0">
       <w:startOverride w:val="3"/>
     </w:lvlOverride>
   </w:num>
   <w:num w:numId="19" w16cid:durableId="478426686">
-    <w:abstractNumId w:val="56"/>
+    <w:abstractNumId w:val="58"/>
     <w:lvlOverride w:ilvl="0">
       <w:startOverride w:val="4"/>
     </w:lvlOverride>
   </w:num>
   <w:num w:numId="20" w16cid:durableId="221140437">
-    <w:abstractNumId w:val="56"/>
+    <w:abstractNumId w:val="58"/>
     <w:lvlOverride w:ilvl="0">
       <w:startOverride w:val="5"/>
     </w:lvlOverride>
   </w:num>
   <w:num w:numId="21" w16cid:durableId="1739745419">
-    <w:abstractNumId w:val="56"/>
+    <w:abstractNumId w:val="58"/>
     <w:lvlOverride w:ilvl="0">
       <w:startOverride w:val="6"/>
     </w:lvlOverride>
   </w:num>
   <w:num w:numId="22" w16cid:durableId="912813924">
-    <w:abstractNumId w:val="52"/>
+    <w:abstractNumId w:val="54"/>
     <w:lvlOverride w:ilvl="0">
       <w:startOverride w:val="1"/>
     </w:lvlOverride>
   </w:num>
   <w:num w:numId="23" w16cid:durableId="1037316861">
-    <w:abstractNumId w:val="52"/>
+    <w:abstractNumId w:val="54"/>
     <w:lvlOverride w:ilvl="0">
       <w:startOverride w:val="2"/>
     </w:lvlOverride>
   </w:num>
   <w:num w:numId="24" w16cid:durableId="1771006621">
-    <w:abstractNumId w:val="52"/>
+    <w:abstractNumId w:val="54"/>
     <w:lvlOverride w:ilvl="0">
       <w:startOverride w:val="3"/>
     </w:lvlOverride>
   </w:num>
   <w:num w:numId="25" w16cid:durableId="1147474115">
-    <w:abstractNumId w:val="52"/>
+    <w:abstractNumId w:val="54"/>
     <w:lvlOverride w:ilvl="0">
       <w:startOverride w:val="4"/>
     </w:lvlOverride>
   </w:num>
   <w:num w:numId="26" w16cid:durableId="1009136692">
-    <w:abstractNumId w:val="52"/>
+    <w:abstractNumId w:val="54"/>
     <w:lvlOverride w:ilvl="0">
       <w:startOverride w:val="5"/>
     </w:lvlOverride>
   </w:num>
   <w:num w:numId="27" w16cid:durableId="1800538526">
-    <w:abstractNumId w:val="52"/>
+    <w:abstractNumId w:val="54"/>
     <w:lvlOverride w:ilvl="0">
       <w:startOverride w:val="6"/>
     </w:lvlOverride>
   </w:num>
   <w:num w:numId="28" w16cid:durableId="1406415535">
-    <w:abstractNumId w:val="44"/>
+    <w:abstractNumId w:val="45"/>
     <w:lvlOverride w:ilvl="0">
       <w:startOverride w:val="1"/>
     </w:lvlOverride>
   </w:num>
   <w:num w:numId="29" w16cid:durableId="1373573247">
-    <w:abstractNumId w:val="44"/>
+    <w:abstractNumId w:val="45"/>
     <w:lvlOverride w:ilvl="0">
       <w:startOverride w:val="2"/>
     </w:lvlOverride>
   </w:num>
   <w:num w:numId="30" w16cid:durableId="1018775728">
-    <w:abstractNumId w:val="44"/>
+    <w:abstractNumId w:val="45"/>
     <w:lvlOverride w:ilvl="0">
       <w:startOverride w:val="3"/>
     </w:lvlOverride>
@@ -27474,31 +29666,31 @@
     </w:lvlOverride>
   </w:num>
   <w:num w:numId="36" w16cid:durableId="2144810059">
-    <w:abstractNumId w:val="23"/>
+    <w:abstractNumId w:val="24"/>
     <w:lvlOverride w:ilvl="0">
       <w:startOverride w:val="1"/>
     </w:lvlOverride>
   </w:num>
   <w:num w:numId="37" w16cid:durableId="2132362901">
-    <w:abstractNumId w:val="23"/>
+    <w:abstractNumId w:val="24"/>
     <w:lvlOverride w:ilvl="0">
       <w:startOverride w:val="2"/>
     </w:lvlOverride>
   </w:num>
   <w:num w:numId="38" w16cid:durableId="529800988">
-    <w:abstractNumId w:val="23"/>
+    <w:abstractNumId w:val="24"/>
     <w:lvlOverride w:ilvl="0">
       <w:startOverride w:val="3"/>
     </w:lvlOverride>
   </w:num>
   <w:num w:numId="39" w16cid:durableId="889879109">
-    <w:abstractNumId w:val="54"/>
+    <w:abstractNumId w:val="56"/>
     <w:lvlOverride w:ilvl="0">
       <w:startOverride w:val="1"/>
     </w:lvlOverride>
   </w:num>
   <w:num w:numId="40" w16cid:durableId="236137003">
-    <w:abstractNumId w:val="54"/>
+    <w:abstractNumId w:val="56"/>
     <w:lvlOverride w:ilvl="0">
       <w:startOverride w:val="2"/>
     </w:lvlOverride>
@@ -27540,49 +29732,49 @@
     </w:lvlOverride>
   </w:num>
   <w:num w:numId="47" w16cid:durableId="512574843">
-    <w:abstractNumId w:val="50"/>
+    <w:abstractNumId w:val="51"/>
     <w:lvlOverride w:ilvl="0">
       <w:startOverride w:val="1"/>
     </w:lvlOverride>
   </w:num>
   <w:num w:numId="48" w16cid:durableId="443352386">
-    <w:abstractNumId w:val="50"/>
+    <w:abstractNumId w:val="51"/>
     <w:lvlOverride w:ilvl="0">
       <w:startOverride w:val="2"/>
     </w:lvlOverride>
   </w:num>
   <w:num w:numId="49" w16cid:durableId="1186864200">
-    <w:abstractNumId w:val="50"/>
+    <w:abstractNumId w:val="51"/>
     <w:lvlOverride w:ilvl="0">
       <w:startOverride w:val="3"/>
     </w:lvlOverride>
   </w:num>
   <w:num w:numId="50" w16cid:durableId="29110377">
-    <w:abstractNumId w:val="50"/>
+    <w:abstractNumId w:val="51"/>
     <w:lvlOverride w:ilvl="0">
       <w:startOverride w:val="4"/>
     </w:lvlOverride>
   </w:num>
   <w:num w:numId="51" w16cid:durableId="1185948214">
-    <w:abstractNumId w:val="50"/>
+    <w:abstractNumId w:val="51"/>
     <w:lvlOverride w:ilvl="0">
       <w:startOverride w:val="5"/>
     </w:lvlOverride>
   </w:num>
   <w:num w:numId="52" w16cid:durableId="17053597">
-    <w:abstractNumId w:val="22"/>
+    <w:abstractNumId w:val="23"/>
     <w:lvlOverride w:ilvl="0">
       <w:startOverride w:val="1"/>
     </w:lvlOverride>
   </w:num>
   <w:num w:numId="53" w16cid:durableId="1551989550">
-    <w:abstractNumId w:val="22"/>
+    <w:abstractNumId w:val="23"/>
     <w:lvlOverride w:ilvl="0">
       <w:startOverride w:val="2"/>
     </w:lvlOverride>
   </w:num>
   <w:num w:numId="54" w16cid:durableId="206993334">
-    <w:abstractNumId w:val="22"/>
+    <w:abstractNumId w:val="23"/>
     <w:lvlOverride w:ilvl="0">
       <w:startOverride w:val="3"/>
     </w:lvlOverride>
@@ -27600,55 +29792,55 @@
     </w:lvlOverride>
   </w:num>
   <w:num w:numId="57" w16cid:durableId="1853298391">
-    <w:abstractNumId w:val="36"/>
+    <w:abstractNumId w:val="37"/>
     <w:lvlOverride w:ilvl="0">
       <w:startOverride w:val="1"/>
     </w:lvlOverride>
   </w:num>
   <w:num w:numId="58" w16cid:durableId="798182981">
-    <w:abstractNumId w:val="36"/>
+    <w:abstractNumId w:val="37"/>
     <w:lvlOverride w:ilvl="0">
       <w:startOverride w:val="2"/>
     </w:lvlOverride>
   </w:num>
   <w:num w:numId="59" w16cid:durableId="1206060660">
-    <w:abstractNumId w:val="36"/>
+    <w:abstractNumId w:val="37"/>
     <w:lvlOverride w:ilvl="0">
       <w:startOverride w:val="3"/>
     </w:lvlOverride>
   </w:num>
   <w:num w:numId="60" w16cid:durableId="1368024754">
-    <w:abstractNumId w:val="42"/>
+    <w:abstractNumId w:val="43"/>
     <w:lvlOverride w:ilvl="0">
       <w:startOverride w:val="1"/>
     </w:lvlOverride>
   </w:num>
   <w:num w:numId="61" w16cid:durableId="1198662669">
-    <w:abstractNumId w:val="42"/>
+    <w:abstractNumId w:val="43"/>
     <w:lvlOverride w:ilvl="0">
       <w:startOverride w:val="2"/>
     </w:lvlOverride>
   </w:num>
   <w:num w:numId="62" w16cid:durableId="669064747">
-    <w:abstractNumId w:val="42"/>
+    <w:abstractNumId w:val="43"/>
     <w:lvlOverride w:ilvl="0">
       <w:startOverride w:val="3"/>
     </w:lvlOverride>
   </w:num>
   <w:num w:numId="63" w16cid:durableId="295256051">
-    <w:abstractNumId w:val="42"/>
+    <w:abstractNumId w:val="43"/>
     <w:lvlOverride w:ilvl="0">
       <w:startOverride w:val="4"/>
     </w:lvlOverride>
   </w:num>
   <w:num w:numId="64" w16cid:durableId="259409270">
-    <w:abstractNumId w:val="42"/>
+    <w:abstractNumId w:val="43"/>
     <w:lvlOverride w:ilvl="0">
       <w:startOverride w:val="5"/>
     </w:lvlOverride>
   </w:num>
   <w:num w:numId="65" w16cid:durableId="1586959424">
-    <w:abstractNumId w:val="42"/>
+    <w:abstractNumId w:val="43"/>
     <w:lvlOverride w:ilvl="0">
       <w:startOverride w:val="6"/>
     </w:lvlOverride>
@@ -27702,31 +29894,31 @@
     </w:lvlOverride>
   </w:num>
   <w:num w:numId="74" w16cid:durableId="1370495007">
-    <w:abstractNumId w:val="41"/>
+    <w:abstractNumId w:val="42"/>
     <w:lvlOverride w:ilvl="0">
       <w:startOverride w:val="1"/>
     </w:lvlOverride>
   </w:num>
   <w:num w:numId="75" w16cid:durableId="2129006821">
-    <w:abstractNumId w:val="41"/>
+    <w:abstractNumId w:val="42"/>
     <w:lvlOverride w:ilvl="0">
       <w:startOverride w:val="2"/>
     </w:lvlOverride>
   </w:num>
   <w:num w:numId="76" w16cid:durableId="340013100">
-    <w:abstractNumId w:val="41"/>
+    <w:abstractNumId w:val="42"/>
     <w:lvlOverride w:ilvl="0">
       <w:startOverride w:val="3"/>
     </w:lvlOverride>
   </w:num>
   <w:num w:numId="77" w16cid:durableId="1708139681">
-    <w:abstractNumId w:val="41"/>
+    <w:abstractNumId w:val="42"/>
     <w:lvlOverride w:ilvl="0">
       <w:startOverride w:val="4"/>
     </w:lvlOverride>
   </w:num>
   <w:num w:numId="78" w16cid:durableId="401293866">
-    <w:abstractNumId w:val="41"/>
+    <w:abstractNumId w:val="42"/>
     <w:lvlOverride w:ilvl="0">
       <w:startOverride w:val="5"/>
     </w:lvlOverride>
@@ -27756,43 +29948,43 @@
     </w:lvlOverride>
   </w:num>
   <w:num w:numId="83" w16cid:durableId="713694665">
-    <w:abstractNumId w:val="20"/>
+    <w:abstractNumId w:val="21"/>
     <w:lvlOverride w:ilvl="0">
       <w:startOverride w:val="1"/>
     </w:lvlOverride>
   </w:num>
   <w:num w:numId="84" w16cid:durableId="1917786374">
-    <w:abstractNumId w:val="20"/>
+    <w:abstractNumId w:val="21"/>
     <w:lvlOverride w:ilvl="0">
       <w:startOverride w:val="2"/>
     </w:lvlOverride>
   </w:num>
   <w:num w:numId="85" w16cid:durableId="565801900">
-    <w:abstractNumId w:val="20"/>
+    <w:abstractNumId w:val="21"/>
     <w:lvlOverride w:ilvl="0">
       <w:startOverride w:val="3"/>
     </w:lvlOverride>
   </w:num>
   <w:num w:numId="86" w16cid:durableId="1751611387">
-    <w:abstractNumId w:val="20"/>
+    <w:abstractNumId w:val="21"/>
     <w:lvlOverride w:ilvl="0">
       <w:startOverride w:val="4"/>
     </w:lvlOverride>
   </w:num>
   <w:num w:numId="87" w16cid:durableId="838272693">
-    <w:abstractNumId w:val="46"/>
+    <w:abstractNumId w:val="47"/>
     <w:lvlOverride w:ilvl="0">
       <w:startOverride w:val="1"/>
     </w:lvlOverride>
   </w:num>
   <w:num w:numId="88" w16cid:durableId="1087194490">
-    <w:abstractNumId w:val="46"/>
+    <w:abstractNumId w:val="47"/>
     <w:lvlOverride w:ilvl="0">
       <w:startOverride w:val="2"/>
     </w:lvlOverride>
   </w:num>
   <w:num w:numId="89" w16cid:durableId="158008450">
-    <w:abstractNumId w:val="46"/>
+    <w:abstractNumId w:val="47"/>
     <w:lvlOverride w:ilvl="0">
       <w:startOverride w:val="3"/>
     </w:lvlOverride>
@@ -27816,37 +30008,37 @@
     </w:lvlOverride>
   </w:num>
   <w:num w:numId="93" w16cid:durableId="84348726">
-    <w:abstractNumId w:val="31"/>
+    <w:abstractNumId w:val="32"/>
     <w:lvlOverride w:ilvl="0">
       <w:startOverride w:val="1"/>
     </w:lvlOverride>
   </w:num>
   <w:num w:numId="94" w16cid:durableId="1091048722">
-    <w:abstractNumId w:val="31"/>
+    <w:abstractNumId w:val="32"/>
     <w:lvlOverride w:ilvl="0">
       <w:startOverride w:val="2"/>
     </w:lvlOverride>
   </w:num>
   <w:num w:numId="95" w16cid:durableId="1866553409">
-    <w:abstractNumId w:val="32"/>
+    <w:abstractNumId w:val="33"/>
     <w:lvlOverride w:ilvl="0">
       <w:startOverride w:val="1"/>
     </w:lvlOverride>
   </w:num>
   <w:num w:numId="96" w16cid:durableId="57676106">
-    <w:abstractNumId w:val="32"/>
+    <w:abstractNumId w:val="33"/>
     <w:lvlOverride w:ilvl="0">
       <w:startOverride w:val="2"/>
     </w:lvlOverride>
   </w:num>
   <w:num w:numId="97" w16cid:durableId="1988197149">
-    <w:abstractNumId w:val="32"/>
+    <w:abstractNumId w:val="33"/>
     <w:lvlOverride w:ilvl="0">
       <w:startOverride w:val="3"/>
     </w:lvlOverride>
   </w:num>
   <w:num w:numId="98" w16cid:durableId="1717584828">
-    <w:abstractNumId w:val="32"/>
+    <w:abstractNumId w:val="33"/>
     <w:lvlOverride w:ilvl="0">
       <w:startOverride w:val="4"/>
     </w:lvlOverride>
@@ -27888,88 +30080,88 @@
     </w:lvlOverride>
   </w:num>
   <w:num w:numId="105" w16cid:durableId="1032809036">
-    <w:abstractNumId w:val="26"/>
+    <w:abstractNumId w:val="27"/>
     <w:lvlOverride w:ilvl="0">
       <w:startOverride w:val="1"/>
     </w:lvlOverride>
   </w:num>
   <w:num w:numId="106" w16cid:durableId="191920691">
-    <w:abstractNumId w:val="26"/>
+    <w:abstractNumId w:val="27"/>
     <w:lvlOverride w:ilvl="0">
       <w:startOverride w:val="2"/>
     </w:lvlOverride>
   </w:num>
   <w:num w:numId="107" w16cid:durableId="695082994">
-    <w:abstractNumId w:val="26"/>
+    <w:abstractNumId w:val="27"/>
     <w:lvlOverride w:ilvl="0">
       <w:startOverride w:val="3"/>
     </w:lvlOverride>
   </w:num>
   <w:num w:numId="108" w16cid:durableId="110129886">
-    <w:abstractNumId w:val="26"/>
+    <w:abstractNumId w:val="27"/>
     <w:lvlOverride w:ilvl="0">
       <w:startOverride w:val="4"/>
     </w:lvlOverride>
   </w:num>
   <w:num w:numId="109" w16cid:durableId="6948564">
-    <w:abstractNumId w:val="35"/>
+    <w:abstractNumId w:val="36"/>
     <w:lvlOverride w:ilvl="0">
       <w:startOverride w:val="1"/>
     </w:lvlOverride>
   </w:num>
   <w:num w:numId="110" w16cid:durableId="1474133241">
-    <w:abstractNumId w:val="35"/>
+    <w:abstractNumId w:val="36"/>
     <w:lvlOverride w:ilvl="0">
       <w:startOverride w:val="2"/>
     </w:lvlOverride>
   </w:num>
   <w:num w:numId="111" w16cid:durableId="838232184">
-    <w:abstractNumId w:val="35"/>
+    <w:abstractNumId w:val="36"/>
     <w:lvlOverride w:ilvl="0">
       <w:startOverride w:val="3"/>
     </w:lvlOverride>
   </w:num>
   <w:num w:numId="112" w16cid:durableId="707069918">
-    <w:abstractNumId w:val="27"/>
+    <w:abstractNumId w:val="28"/>
   </w:num>
   <w:num w:numId="113" w16cid:durableId="243690866">
-    <w:abstractNumId w:val="53"/>
+    <w:abstractNumId w:val="55"/>
   </w:num>
   <w:num w:numId="114" w16cid:durableId="146828787">
     <w:abstractNumId w:val="6"/>
   </w:num>
   <w:num w:numId="115" w16cid:durableId="1291012561">
-    <w:abstractNumId w:val="33"/>
+    <w:abstractNumId w:val="34"/>
   </w:num>
   <w:num w:numId="116" w16cid:durableId="1273584681">
-    <w:abstractNumId w:val="30"/>
+    <w:abstractNumId w:val="31"/>
   </w:num>
   <w:num w:numId="117" w16cid:durableId="1464467648">
-    <w:abstractNumId w:val="24"/>
+    <w:abstractNumId w:val="25"/>
   </w:num>
   <w:num w:numId="118" w16cid:durableId="868689862">
-    <w:abstractNumId w:val="49"/>
+    <w:abstractNumId w:val="50"/>
   </w:num>
   <w:num w:numId="119" w16cid:durableId="53043007">
     <w:abstractNumId w:val="11"/>
   </w:num>
   <w:num w:numId="120" w16cid:durableId="1467434901">
-    <w:abstractNumId w:val="37"/>
+    <w:abstractNumId w:val="38"/>
   </w:num>
   <w:num w:numId="121" w16cid:durableId="60521339">
-    <w:abstractNumId w:val="43"/>
+    <w:abstractNumId w:val="44"/>
   </w:num>
   <w:num w:numId="122" w16cid:durableId="1716002365">
     <w:abstractNumId w:val="0"/>
   </w:num>
   <w:num w:numId="123" w16cid:durableId="1614559974">
-    <w:abstractNumId w:val="39"/>
+    <w:abstractNumId w:val="40"/>
   </w:num>
   <w:num w:numId="124" w16cid:durableId="1231772466">
-    <w:abstractNumId w:val="40"/>
+    <w:abstractNumId w:val="41"/>
   </w:num>
   <w:num w:numId="125" w16cid:durableId="1757676617">
-    <w:abstractNumId w:val="47"/>
+    <w:abstractNumId w:val="48"/>
   </w:num>
   <w:num w:numId="126" w16cid:durableId="972252707">
     <w:abstractNumId w:val="19"/>
@@ -27978,13 +30170,13 @@
     <w:abstractNumId w:val="3"/>
   </w:num>
   <w:num w:numId="128" w16cid:durableId="1658420690">
-    <w:abstractNumId w:val="55"/>
+    <w:abstractNumId w:val="57"/>
   </w:num>
   <w:num w:numId="129" w16cid:durableId="1669559929">
-    <w:abstractNumId w:val="21"/>
+    <w:abstractNumId w:val="22"/>
   </w:num>
   <w:num w:numId="130" w16cid:durableId="1318724904">
-    <w:abstractNumId w:val="38"/>
+    <w:abstractNumId w:val="39"/>
   </w:num>
   <w:num w:numId="131" w16cid:durableId="738406774">
     <w:abstractNumId w:val="18"/>
@@ -27993,19 +30185,25 @@
     <w:abstractNumId w:val="2"/>
   </w:num>
   <w:num w:numId="133" w16cid:durableId="97651581">
-    <w:abstractNumId w:val="28"/>
+    <w:abstractNumId w:val="29"/>
   </w:num>
   <w:num w:numId="134" w16cid:durableId="766274093">
-    <w:abstractNumId w:val="34"/>
+    <w:abstractNumId w:val="35"/>
   </w:num>
   <w:num w:numId="135" w16cid:durableId="1930656821">
-    <w:abstractNumId w:val="25"/>
+    <w:abstractNumId w:val="26"/>
   </w:num>
   <w:num w:numId="136" w16cid:durableId="1215779574">
-    <w:abstractNumId w:val="45"/>
+    <w:abstractNumId w:val="46"/>
   </w:num>
   <w:num w:numId="137" w16cid:durableId="317537635">
-    <w:abstractNumId w:val="48"/>
+    <w:abstractNumId w:val="49"/>
+  </w:num>
+  <w:num w:numId="138" w16cid:durableId="227156763">
+    <w:abstractNumId w:val="20"/>
+  </w:num>
+  <w:num w:numId="139" w16cid:durableId="1814370818">
+    <w:abstractNumId w:val="52"/>
   </w:num>
   <w:numIdMacAtCleanup w:val="137"/>
 </w:numbering>

</xml_diff>